<commit_message>
Lesson 6: the sheet is the source again
The author asked for the Word file to be fixed rather than corrected in the
generator, so the docx now carries everything the lesson needs: the Mushaf's
maddah on حَـٰٓ, four filled columns on every table (ḥarfī gains Type and
Length), the fifth heading renamed "Madd Badal, ʿIwaḍ and Līn" with ٱلرَّحِيمِ
moved out and the līn rows heard continuing, and a sixth table, "Madd ʿĀriḍ
li-s-Sukūn", whose Word cells read "<word> وقف" so the intake tool names the
take without anyone typing. The edit was made on word/document.xml inside
the zip with every change reported and tag balance checked.

The generator retires its CORRECTIONS block, reads the ʿāriḍ table instead
of deriving it (stripping the وقف tag off the word), and drops the linHere
override now that the sheet says "2 ḥarakāt (recitation continues)" itself.
Same 52 cards; ḥarfī rows gain Muthaqqal/Mukhaffaf chips.

Co-Authored-By: Claude Opus 5 <noreply@anthropic.com>
</commit_message>
<xml_diff>
--- a/Word Tables/مد لازم صلة عوض +.docx
+++ b/Word Tables/مد لازم صلة عوض +.docx
@@ -69,9 +69,10 @@
         <w:tblLook w:val="04A0" w:firstRow="1" w:lastRow="0" w:firstColumn="1" w:lastColumn="0" w:noHBand="0" w:noVBand="1"/>
       </w:tblPr>
       <w:tblGrid>
-        <w:gridCol w:w="2300"/>
-        <w:gridCol w:w="2900"/>
-        <w:gridCol w:w="4160"/>
+        <w:gridCol w:w="1960"/>
+        <w:gridCol w:w="2360"/>
+        <w:gridCol w:w="1980"/>
+        <w:gridCol w:w="3060"/>
       </w:tblGrid>
       <w:tr>
         <w:tblPrEx>
@@ -86,7 +87,7 @@
         </w:trPr>
         <w:tc>
           <w:tcPr>
-            <w:tcW w:w="2300" w:type="dxa"/>
+            <w:tcW w:w="1960" w:type="dxa"/>
             <w:shd w:val="clear" w:color="auto" w:fill="2F5496"/>
             <w:vAlign w:val="center"/>
           </w:tcPr>
@@ -113,7 +114,7 @@
         </w:tc>
         <w:tc>
           <w:tcPr>
-            <w:tcW w:w="2900" w:type="dxa"/>
+            <w:tcW w:w="2360" w:type="dxa"/>
             <w:shd w:val="clear" w:color="auto" w:fill="2F5496"/>
             <w:vAlign w:val="center"/>
           </w:tcPr>
@@ -140,7 +141,34 @@
         </w:tc>
         <w:tc>
           <w:tcPr>
-            <w:tcW w:w="4160" w:type="dxa"/>
+            <w:tcW w:w="1980" w:type="dxa"/>
+            <w:shd w:val="clear" w:color="auto" w:fill="2F5496"/>
+            <w:vAlign w:val="center"/>
+          </w:tcPr>
+          <w:p>
+            <w:pPr>
+              <w:spacing w:before="60" w:after="60"/>
+              <w:rPr>
+                <w:rFonts w:ascii="Aptos" w:hAnsi="Aptos" w:cs="Aptos"/>
+                <w:b/>
+                <w:bCs/>
+                <w:color w:val="FFFFFF"/>
+              </w:rPr>
+            </w:pPr>
+            <w:r>
+              <w:rPr>
+                <w:rFonts w:ascii="Aptos" w:hAnsi="Aptos" w:cs="Aptos"/>
+                <w:b/>
+                <w:bCs/>
+                <w:color w:val="FFFFFF"/>
+              </w:rPr>
+              <w:t xml:space="preserve">Length</w:t>
+            </w:r>
+          </w:p>
+        </w:tc>
+        <w:tc>
+          <w:tcPr>
+            <w:tcW w:w="3060" w:type="dxa"/>
             <w:shd w:val="clear" w:color="auto" w:fill="2F5496"/>
             <w:vAlign w:val="center"/>
           </w:tcPr>
@@ -178,7 +206,7 @@
         </w:trPr>
         <w:tc>
           <w:tcPr>
-            <w:tcW w:w="2300" w:type="dxa"/>
+            <w:tcW w:w="1960" w:type="dxa"/>
             <w:vAlign w:val="center"/>
           </w:tcPr>
           <w:p>
@@ -208,7 +236,7 @@
         </w:tc>
         <w:tc>
           <w:tcPr>
-            <w:tcW w:w="2900" w:type="dxa"/>
+            <w:tcW w:w="2360" w:type="dxa"/>
             <w:vAlign w:val="center"/>
           </w:tcPr>
           <w:p>
@@ -264,7 +292,31 @@
         </w:tc>
         <w:tc>
           <w:tcPr>
-            <w:tcW w:w="4160" w:type="dxa"/>
+            <w:tcW w:w="1980" w:type="dxa"/>
+            <w:vAlign w:val="center"/>
+          </w:tcPr>
+          <w:p>
+            <w:pPr>
+              <w:spacing w:before="60" w:after="60" w:line="240" w:lineRule="auto"/>
+              <w:rPr>
+                <w:rFonts w:ascii="Aptos" w:hAnsi="Aptos" w:cs="Aptos"/>
+                <w:sz w:val="22"/>
+                <w:szCs w:val="22"/>
+              </w:rPr>
+            </w:pPr>
+            <w:r>
+              <w:rPr>
+                <w:rFonts w:ascii="Aptos" w:hAnsi="Aptos" w:cs="Aptos"/>
+                <w:sz w:val="22"/>
+                <w:szCs w:val="22"/>
+              </w:rPr>
+              <w:t xml:space="preserve">6 ḥarakāt</w:t>
+            </w:r>
+          </w:p>
+        </w:tc>
+        <w:tc>
+          <w:tcPr>
+            <w:tcW w:w="3060" w:type="dxa"/>
             <w:vAlign w:val="center"/>
           </w:tcPr>
           <w:p>
@@ -341,7 +393,7 @@
         </w:trPr>
         <w:tc>
           <w:tcPr>
-            <w:tcW w:w="2300" w:type="dxa"/>
+            <w:tcW w:w="1960" w:type="dxa"/>
             <w:shd w:val="clear" w:color="auto" w:fill="DEEAF6"/>
             <w:vAlign w:val="center"/>
           </w:tcPr>
@@ -372,7 +424,7 @@
         </w:tc>
         <w:tc>
           <w:tcPr>
-            <w:tcW w:w="2900" w:type="dxa"/>
+            <w:tcW w:w="2360" w:type="dxa"/>
             <w:shd w:val="clear" w:color="auto" w:fill="DEEAF6"/>
             <w:vAlign w:val="center"/>
           </w:tcPr>
@@ -429,7 +481,31 @@
         </w:tc>
         <w:tc>
           <w:tcPr>
-            <w:tcW w:w="4160" w:type="dxa"/>
+            <w:tcW w:w="1980" w:type="dxa"/>
+            <w:vAlign w:val="center"/>
+          </w:tcPr>
+          <w:p>
+            <w:pPr>
+              <w:spacing w:before="60" w:after="60" w:line="240" w:lineRule="auto"/>
+              <w:rPr>
+                <w:rFonts w:ascii="Aptos" w:hAnsi="Aptos" w:cs="Aptos"/>
+                <w:sz w:val="22"/>
+                <w:szCs w:val="22"/>
+              </w:rPr>
+            </w:pPr>
+            <w:r>
+              <w:rPr>
+                <w:rFonts w:ascii="Aptos" w:hAnsi="Aptos" w:cs="Aptos"/>
+                <w:sz w:val="22"/>
+                <w:szCs w:val="22"/>
+              </w:rPr>
+              <w:t xml:space="preserve">6 ḥarakāt</w:t>
+            </w:r>
+          </w:p>
+        </w:tc>
+        <w:tc>
+          <w:tcPr>
+            <w:tcW w:w="3060" w:type="dxa"/>
             <w:shd w:val="clear" w:color="auto" w:fill="DEEAF6"/>
             <w:vAlign w:val="center"/>
           </w:tcPr>
@@ -501,7 +577,7 @@
         </w:trPr>
         <w:tc>
           <w:tcPr>
-            <w:tcW w:w="2300" w:type="dxa"/>
+            <w:tcW w:w="1960" w:type="dxa"/>
             <w:vAlign w:val="center"/>
           </w:tcPr>
           <w:p>
@@ -531,7 +607,7 @@
         </w:tc>
         <w:tc>
           <w:tcPr>
-            <w:tcW w:w="2900" w:type="dxa"/>
+            <w:tcW w:w="2360" w:type="dxa"/>
             <w:vAlign w:val="center"/>
           </w:tcPr>
           <w:p>
@@ -587,7 +663,31 @@
         </w:tc>
         <w:tc>
           <w:tcPr>
-            <w:tcW w:w="4160" w:type="dxa"/>
+            <w:tcW w:w="1980" w:type="dxa"/>
+            <w:vAlign w:val="center"/>
+          </w:tcPr>
+          <w:p>
+            <w:pPr>
+              <w:spacing w:before="60" w:after="60" w:line="240" w:lineRule="auto"/>
+              <w:rPr>
+                <w:rFonts w:ascii="Aptos" w:hAnsi="Aptos" w:cs="Aptos"/>
+                <w:sz w:val="22"/>
+                <w:szCs w:val="22"/>
+              </w:rPr>
+            </w:pPr>
+            <w:r>
+              <w:rPr>
+                <w:rFonts w:ascii="Aptos" w:hAnsi="Aptos" w:cs="Aptos"/>
+                <w:sz w:val="22"/>
+                <w:szCs w:val="22"/>
+              </w:rPr>
+              <w:t xml:space="preserve">6 ḥarakāt</w:t>
+            </w:r>
+          </w:p>
+        </w:tc>
+        <w:tc>
+          <w:tcPr>
+            <w:tcW w:w="3060" w:type="dxa"/>
             <w:vAlign w:val="center"/>
           </w:tcPr>
           <w:p>
@@ -652,7 +752,7 @@
         </w:trPr>
         <w:tc>
           <w:tcPr>
-            <w:tcW w:w="2300" w:type="dxa"/>
+            <w:tcW w:w="1960" w:type="dxa"/>
             <w:shd w:val="clear" w:color="auto" w:fill="DEEAF6"/>
             <w:vAlign w:val="center"/>
           </w:tcPr>
@@ -681,7 +781,7 @@
         </w:tc>
         <w:tc>
           <w:tcPr>
-            <w:tcW w:w="2900" w:type="dxa"/>
+            <w:tcW w:w="2360" w:type="dxa"/>
             <w:shd w:val="clear" w:color="auto" w:fill="DEEAF6"/>
             <w:vAlign w:val="center"/>
           </w:tcPr>
@@ -738,7 +838,31 @@
         </w:tc>
         <w:tc>
           <w:tcPr>
-            <w:tcW w:w="4160" w:type="dxa"/>
+            <w:tcW w:w="1980" w:type="dxa"/>
+            <w:vAlign w:val="center"/>
+          </w:tcPr>
+          <w:p>
+            <w:pPr>
+              <w:spacing w:before="60" w:after="60" w:line="240" w:lineRule="auto"/>
+              <w:rPr>
+                <w:rFonts w:ascii="Aptos" w:hAnsi="Aptos" w:cs="Aptos"/>
+                <w:sz w:val="22"/>
+                <w:szCs w:val="22"/>
+              </w:rPr>
+            </w:pPr>
+            <w:r>
+              <w:rPr>
+                <w:rFonts w:ascii="Aptos" w:hAnsi="Aptos" w:cs="Aptos"/>
+                <w:sz w:val="22"/>
+                <w:szCs w:val="22"/>
+              </w:rPr>
+              <w:t xml:space="preserve">6 ḥarakāt</w:t>
+            </w:r>
+          </w:p>
+        </w:tc>
+        <w:tc>
+          <w:tcPr>
+            <w:tcW w:w="3060" w:type="dxa"/>
             <w:shd w:val="clear" w:color="auto" w:fill="DEEAF6"/>
             <w:vAlign w:val="center"/>
           </w:tcPr>
@@ -796,7 +920,7 @@
         </w:trPr>
         <w:tc>
           <w:tcPr>
-            <w:tcW w:w="2300" w:type="dxa"/>
+            <w:tcW w:w="1960" w:type="dxa"/>
             <w:vAlign w:val="center"/>
           </w:tcPr>
           <w:p>
@@ -826,7 +950,7 @@
         </w:tc>
         <w:tc>
           <w:tcPr>
-            <w:tcW w:w="2900" w:type="dxa"/>
+            <w:tcW w:w="2360" w:type="dxa"/>
             <w:vAlign w:val="center"/>
           </w:tcPr>
           <w:p>
@@ -882,7 +1006,31 @@
         </w:tc>
         <w:tc>
           <w:tcPr>
-            <w:tcW w:w="4160" w:type="dxa"/>
+            <w:tcW w:w="1980" w:type="dxa"/>
+            <w:vAlign w:val="center"/>
+          </w:tcPr>
+          <w:p>
+            <w:pPr>
+              <w:spacing w:before="60" w:after="60" w:line="240" w:lineRule="auto"/>
+              <w:rPr>
+                <w:rFonts w:ascii="Aptos" w:hAnsi="Aptos" w:cs="Aptos"/>
+                <w:sz w:val="22"/>
+                <w:szCs w:val="22"/>
+              </w:rPr>
+            </w:pPr>
+            <w:r>
+              <w:rPr>
+                <w:rFonts w:ascii="Aptos" w:hAnsi="Aptos" w:cs="Aptos"/>
+                <w:sz w:val="22"/>
+                <w:szCs w:val="22"/>
+              </w:rPr>
+              <w:t xml:space="preserve">6 ḥarakāt</w:t>
+            </w:r>
+          </w:p>
+        </w:tc>
+        <w:tc>
+          <w:tcPr>
+            <w:tcW w:w="3060" w:type="dxa"/>
             <w:vAlign w:val="center"/>
           </w:tcPr>
           <w:p>
@@ -951,7 +1099,7 @@
         </w:trPr>
         <w:tc>
           <w:tcPr>
-            <w:tcW w:w="2300" w:type="dxa"/>
+            <w:tcW w:w="1960" w:type="dxa"/>
             <w:shd w:val="clear" w:color="auto" w:fill="DEEAF6"/>
             <w:vAlign w:val="center"/>
           </w:tcPr>
@@ -975,14 +1123,14 @@
                 <w:szCs w:val="44"/>
                 <w:rtl/>
               </w:rPr>
-              <w:t>أَتُحَـٰجُّوٓنِّى</w:t>
-            </w:r>
-            <w:proofErr w:type="spellEnd"/>
-          </w:p>
-        </w:tc>
-        <w:tc>
-          <w:tcPr>
-            <w:tcW w:w="2900" w:type="dxa"/>
+              <w:t>أَتُحَـٰٓجُّوٓنِّى</w:t>
+            </w:r>
+            <w:proofErr w:type="spellEnd"/>
+          </w:p>
+        </w:tc>
+        <w:tc>
+          <w:tcPr>
+            <w:tcW w:w="2360" w:type="dxa"/>
             <w:shd w:val="clear" w:color="auto" w:fill="DEEAF6"/>
             <w:vAlign w:val="center"/>
           </w:tcPr>
@@ -1039,7 +1187,31 @@
         </w:tc>
         <w:tc>
           <w:tcPr>
-            <w:tcW w:w="4160" w:type="dxa"/>
+            <w:tcW w:w="1980" w:type="dxa"/>
+            <w:vAlign w:val="center"/>
+          </w:tcPr>
+          <w:p>
+            <w:pPr>
+              <w:spacing w:before="60" w:after="60" w:line="240" w:lineRule="auto"/>
+              <w:rPr>
+                <w:rFonts w:ascii="Aptos" w:hAnsi="Aptos" w:cs="Aptos"/>
+                <w:sz w:val="22"/>
+                <w:szCs w:val="22"/>
+              </w:rPr>
+            </w:pPr>
+            <w:r>
+              <w:rPr>
+                <w:rFonts w:ascii="Aptos" w:hAnsi="Aptos" w:cs="Aptos"/>
+                <w:sz w:val="22"/>
+                <w:szCs w:val="22"/>
+              </w:rPr>
+              <w:t xml:space="preserve">6 ḥarakāt</w:t>
+            </w:r>
+          </w:p>
+        </w:tc>
+        <w:tc>
+          <w:tcPr>
+            <w:tcW w:w="3060" w:type="dxa"/>
             <w:shd w:val="clear" w:color="auto" w:fill="DEEAF6"/>
             <w:vAlign w:val="center"/>
           </w:tcPr>
@@ -1103,7 +1275,7 @@
         </w:trPr>
         <w:tc>
           <w:tcPr>
-            <w:tcW w:w="2300" w:type="dxa"/>
+            <w:tcW w:w="1960" w:type="dxa"/>
             <w:vAlign w:val="center"/>
           </w:tcPr>
           <w:p>
@@ -1133,7 +1305,7 @@
         </w:tc>
         <w:tc>
           <w:tcPr>
-            <w:tcW w:w="2900" w:type="dxa"/>
+            <w:tcW w:w="2360" w:type="dxa"/>
             <w:vAlign w:val="center"/>
           </w:tcPr>
           <w:p>
@@ -1189,7 +1361,31 @@
         </w:tc>
         <w:tc>
           <w:tcPr>
-            <w:tcW w:w="4160" w:type="dxa"/>
+            <w:tcW w:w="1980" w:type="dxa"/>
+            <w:vAlign w:val="center"/>
+          </w:tcPr>
+          <w:p>
+            <w:pPr>
+              <w:spacing w:before="60" w:after="60" w:line="240" w:lineRule="auto"/>
+              <w:rPr>
+                <w:rFonts w:ascii="Aptos" w:hAnsi="Aptos" w:cs="Aptos"/>
+                <w:sz w:val="22"/>
+                <w:szCs w:val="22"/>
+              </w:rPr>
+            </w:pPr>
+            <w:r>
+              <w:rPr>
+                <w:rFonts w:ascii="Aptos" w:hAnsi="Aptos" w:cs="Aptos"/>
+                <w:sz w:val="22"/>
+                <w:szCs w:val="22"/>
+              </w:rPr>
+              <w:t xml:space="preserve">6 ḥarakāt</w:t>
+            </w:r>
+          </w:p>
+        </w:tc>
+        <w:tc>
+          <w:tcPr>
+            <w:tcW w:w="3060" w:type="dxa"/>
             <w:vAlign w:val="center"/>
           </w:tcPr>
           <w:p>
@@ -1246,7 +1442,7 @@
         </w:trPr>
         <w:tc>
           <w:tcPr>
-            <w:tcW w:w="2300" w:type="dxa"/>
+            <w:tcW w:w="1960" w:type="dxa"/>
             <w:shd w:val="clear" w:color="auto" w:fill="DEEAF6"/>
             <w:vAlign w:val="center"/>
           </w:tcPr>
@@ -1277,7 +1473,7 @@
         </w:tc>
         <w:tc>
           <w:tcPr>
-            <w:tcW w:w="2900" w:type="dxa"/>
+            <w:tcW w:w="2360" w:type="dxa"/>
             <w:shd w:val="clear" w:color="auto" w:fill="DEEAF6"/>
             <w:vAlign w:val="center"/>
           </w:tcPr>
@@ -1334,7 +1530,31 @@
         </w:tc>
         <w:tc>
           <w:tcPr>
-            <w:tcW w:w="4160" w:type="dxa"/>
+            <w:tcW w:w="1980" w:type="dxa"/>
+            <w:vAlign w:val="center"/>
+          </w:tcPr>
+          <w:p>
+            <w:pPr>
+              <w:spacing w:before="60" w:after="60" w:line="240" w:lineRule="auto"/>
+              <w:rPr>
+                <w:rFonts w:ascii="Aptos" w:hAnsi="Aptos" w:cs="Aptos"/>
+                <w:sz w:val="22"/>
+                <w:szCs w:val="22"/>
+              </w:rPr>
+            </w:pPr>
+            <w:r>
+              <w:rPr>
+                <w:rFonts w:ascii="Aptos" w:hAnsi="Aptos" w:cs="Aptos"/>
+                <w:sz w:val="22"/>
+                <w:szCs w:val="22"/>
+              </w:rPr>
+              <w:t xml:space="preserve">6 ḥarakāt</w:t>
+            </w:r>
+          </w:p>
+        </w:tc>
+        <w:tc>
+          <w:tcPr>
+            <w:tcW w:w="3060" w:type="dxa"/>
             <w:shd w:val="clear" w:color="auto" w:fill="DEEAF6"/>
             <w:vAlign w:val="center"/>
           </w:tcPr>
@@ -1406,7 +1626,7 @@
         </w:trPr>
         <w:tc>
           <w:tcPr>
-            <w:tcW w:w="2300" w:type="dxa"/>
+            <w:tcW w:w="1960" w:type="dxa"/>
             <w:vAlign w:val="center"/>
           </w:tcPr>
           <w:p>
@@ -1434,7 +1654,7 @@
         </w:tc>
         <w:tc>
           <w:tcPr>
-            <w:tcW w:w="2900" w:type="dxa"/>
+            <w:tcW w:w="2360" w:type="dxa"/>
             <w:vAlign w:val="center"/>
           </w:tcPr>
           <w:p>
@@ -1490,7 +1710,31 @@
         </w:tc>
         <w:tc>
           <w:tcPr>
-            <w:tcW w:w="4160" w:type="dxa"/>
+            <w:tcW w:w="1980" w:type="dxa"/>
+            <w:vAlign w:val="center"/>
+          </w:tcPr>
+          <w:p>
+            <w:pPr>
+              <w:spacing w:before="60" w:after="60" w:line="240" w:lineRule="auto"/>
+              <w:rPr>
+                <w:rFonts w:ascii="Aptos" w:hAnsi="Aptos" w:cs="Aptos"/>
+                <w:sz w:val="22"/>
+                <w:szCs w:val="22"/>
+              </w:rPr>
+            </w:pPr>
+            <w:r>
+              <w:rPr>
+                <w:rFonts w:ascii="Aptos" w:hAnsi="Aptos" w:cs="Aptos"/>
+                <w:sz w:val="22"/>
+                <w:szCs w:val="22"/>
+              </w:rPr>
+              <w:t xml:space="preserve">6 ḥarakāt</w:t>
+            </w:r>
+          </w:p>
+        </w:tc>
+        <w:tc>
+          <w:tcPr>
+            <w:tcW w:w="3060" w:type="dxa"/>
             <w:vAlign w:val="center"/>
           </w:tcPr>
           <w:p>
@@ -1541,7 +1785,7 @@
         </w:trPr>
         <w:tc>
           <w:tcPr>
-            <w:tcW w:w="2300" w:type="dxa"/>
+            <w:tcW w:w="1960" w:type="dxa"/>
             <w:shd w:val="clear" w:color="auto" w:fill="DEEAF6"/>
             <w:vAlign w:val="center"/>
           </w:tcPr>
@@ -1572,7 +1816,7 @@
         </w:tc>
         <w:tc>
           <w:tcPr>
-            <w:tcW w:w="2900" w:type="dxa"/>
+            <w:tcW w:w="2360" w:type="dxa"/>
             <w:shd w:val="clear" w:color="auto" w:fill="DEEAF6"/>
             <w:vAlign w:val="center"/>
           </w:tcPr>
@@ -1629,7 +1873,31 @@
         </w:tc>
         <w:tc>
           <w:tcPr>
-            <w:tcW w:w="4160" w:type="dxa"/>
+            <w:tcW w:w="1980" w:type="dxa"/>
+            <w:vAlign w:val="center"/>
+          </w:tcPr>
+          <w:p>
+            <w:pPr>
+              <w:spacing w:before="60" w:after="60" w:line="240" w:lineRule="auto"/>
+              <w:rPr>
+                <w:rFonts w:ascii="Aptos" w:hAnsi="Aptos" w:cs="Aptos"/>
+                <w:sz w:val="22"/>
+                <w:szCs w:val="22"/>
+              </w:rPr>
+            </w:pPr>
+            <w:r>
+              <w:rPr>
+                <w:rFonts w:ascii="Aptos" w:hAnsi="Aptos" w:cs="Aptos"/>
+                <w:sz w:val="22"/>
+                <w:szCs w:val="22"/>
+              </w:rPr>
+              <w:t xml:space="preserve">6 ḥarakāt</w:t>
+            </w:r>
+          </w:p>
+        </w:tc>
+        <w:tc>
+          <w:tcPr>
+            <w:tcW w:w="3060" w:type="dxa"/>
             <w:shd w:val="clear" w:color="auto" w:fill="DEEAF6"/>
             <w:vAlign w:val="center"/>
           </w:tcPr>
@@ -1701,7 +1969,7 @@
         </w:trPr>
         <w:tc>
           <w:tcPr>
-            <w:tcW w:w="2300" w:type="dxa"/>
+            <w:tcW w:w="1960" w:type="dxa"/>
             <w:vAlign w:val="center"/>
           </w:tcPr>
           <w:p>
@@ -1731,7 +1999,7 @@
         </w:tc>
         <w:tc>
           <w:tcPr>
-            <w:tcW w:w="2900" w:type="dxa"/>
+            <w:tcW w:w="2360" w:type="dxa"/>
             <w:vAlign w:val="center"/>
           </w:tcPr>
           <w:p>
@@ -1801,7 +2069,31 @@
         </w:tc>
         <w:tc>
           <w:tcPr>
-            <w:tcW w:w="4160" w:type="dxa"/>
+            <w:tcW w:w="1980" w:type="dxa"/>
+            <w:vAlign w:val="center"/>
+          </w:tcPr>
+          <w:p>
+            <w:pPr>
+              <w:spacing w:before="60" w:after="60" w:line="240" w:lineRule="auto"/>
+              <w:rPr>
+                <w:rFonts w:ascii="Aptos" w:hAnsi="Aptos" w:cs="Aptos"/>
+                <w:sz w:val="22"/>
+                <w:szCs w:val="22"/>
+              </w:rPr>
+            </w:pPr>
+            <w:r>
+              <w:rPr>
+                <w:rFonts w:ascii="Aptos" w:hAnsi="Aptos" w:cs="Aptos"/>
+                <w:sz w:val="22"/>
+                <w:szCs w:val="22"/>
+              </w:rPr>
+              <w:t xml:space="preserve">6 ḥarakāt</w:t>
+            </w:r>
+          </w:p>
+        </w:tc>
+        <w:tc>
+          <w:tcPr>
+            <w:tcW w:w="3060" w:type="dxa"/>
             <w:vAlign w:val="center"/>
           </w:tcPr>
           <w:p>
@@ -1926,8 +2218,10 @@
         <w:tblLook w:val="0000" w:firstRow="0" w:lastRow="0" w:firstColumn="0" w:lastColumn="0" w:noHBand="0" w:noVBand="0"/>
       </w:tblPr>
       <w:tblGrid>
-        <w:gridCol w:w="3000"/>
-        <w:gridCol w:w="6360"/>
+        <w:gridCol w:w="1960"/>
+        <w:gridCol w:w="2360"/>
+        <w:gridCol w:w="1980"/>
+        <w:gridCol w:w="3060"/>
       </w:tblGrid>
       <w:tr>
         <w:tblPrEx>
@@ -1942,7 +2236,7 @@
         </w:trPr>
         <w:tc>
           <w:tcPr>
-            <w:tcW w:w="3000" w:type="dxa"/>
+            <w:tcW w:w="1960" w:type="dxa"/>
             <w:shd w:val="clear" w:color="auto" w:fill="2F5496"/>
             <w:vAlign w:val="center"/>
           </w:tcPr>
@@ -1969,7 +2263,61 @@
         </w:tc>
         <w:tc>
           <w:tcPr>
-            <w:tcW w:w="6360" w:type="dxa"/>
+            <w:tcW w:w="2360" w:type="dxa"/>
+            <w:shd w:val="clear" w:color="auto" w:fill="2F5496"/>
+            <w:vAlign w:val="center"/>
+          </w:tcPr>
+          <w:p>
+            <w:pPr>
+              <w:spacing w:before="60" w:after="60"/>
+              <w:rPr>
+                <w:rFonts w:ascii="Aptos" w:hAnsi="Aptos" w:cs="Aptos"/>
+                <w:b/>
+                <w:bCs/>
+                <w:color w:val="FFFFFF"/>
+              </w:rPr>
+            </w:pPr>
+            <w:r>
+              <w:rPr>
+                <w:rFonts w:ascii="Aptos" w:hAnsi="Aptos" w:cs="Aptos"/>
+                <w:b/>
+                <w:bCs/>
+                <w:color w:val="FFFFFF"/>
+              </w:rPr>
+              <w:t xml:space="preserve">Type of Madd</w:t>
+            </w:r>
+          </w:p>
+        </w:tc>
+        <w:tc>
+          <w:tcPr>
+            <w:tcW w:w="1980" w:type="dxa"/>
+            <w:shd w:val="clear" w:color="auto" w:fill="2F5496"/>
+            <w:vAlign w:val="center"/>
+          </w:tcPr>
+          <w:p>
+            <w:pPr>
+              <w:spacing w:before="60" w:after="60"/>
+              <w:rPr>
+                <w:rFonts w:ascii="Aptos" w:hAnsi="Aptos" w:cs="Aptos"/>
+                <w:b/>
+                <w:bCs/>
+                <w:color w:val="FFFFFF"/>
+              </w:rPr>
+            </w:pPr>
+            <w:r>
+              <w:rPr>
+                <w:rFonts w:ascii="Aptos" w:hAnsi="Aptos" w:cs="Aptos"/>
+                <w:b/>
+                <w:bCs/>
+                <w:color w:val="FFFFFF"/>
+              </w:rPr>
+              <w:t xml:space="preserve">Length</w:t>
+            </w:r>
+          </w:p>
+        </w:tc>
+        <w:tc>
+          <w:tcPr>
+            <w:tcW w:w="3060" w:type="dxa"/>
             <w:shd w:val="clear" w:color="auto" w:fill="2F5496"/>
             <w:vAlign w:val="center"/>
           </w:tcPr>
@@ -2007,7 +2355,7 @@
         </w:trPr>
         <w:tc>
           <w:tcPr>
-            <w:tcW w:w="3000" w:type="dxa"/>
+            <w:tcW w:w="1960" w:type="dxa"/>
             <w:vAlign w:val="center"/>
           </w:tcPr>
           <w:p>
@@ -2037,7 +2385,55 @@
         </w:tc>
         <w:tc>
           <w:tcPr>
-            <w:tcW w:w="6360" w:type="dxa"/>
+            <w:tcW w:w="2360" w:type="dxa"/>
+            <w:vAlign w:val="center"/>
+          </w:tcPr>
+          <w:p>
+            <w:pPr>
+              <w:spacing w:before="60" w:after="60" w:line="240" w:lineRule="auto"/>
+              <w:rPr>
+                <w:rFonts w:ascii="Aptos" w:hAnsi="Aptos" w:cs="Aptos"/>
+                <w:sz w:val="22"/>
+                <w:szCs w:val="22"/>
+              </w:rPr>
+            </w:pPr>
+            <w:r>
+              <w:rPr>
+                <w:rFonts w:ascii="Aptos" w:hAnsi="Aptos" w:cs="Aptos"/>
+                <w:sz w:val="22"/>
+                <w:szCs w:val="22"/>
+              </w:rPr>
+              <w:t xml:space="preserve">Madd Lāzim Ḥarfī Muthaqqal</w:t>
+            </w:r>
+          </w:p>
+        </w:tc>
+        <w:tc>
+          <w:tcPr>
+            <w:tcW w:w="1980" w:type="dxa"/>
+            <w:vAlign w:val="center"/>
+          </w:tcPr>
+          <w:p>
+            <w:pPr>
+              <w:spacing w:before="60" w:after="60" w:line="240" w:lineRule="auto"/>
+              <w:rPr>
+                <w:rFonts w:ascii="Aptos" w:hAnsi="Aptos" w:cs="Aptos"/>
+                <w:sz w:val="22"/>
+                <w:szCs w:val="22"/>
+              </w:rPr>
+            </w:pPr>
+            <w:r>
+              <w:rPr>
+                <w:rFonts w:ascii="Aptos" w:hAnsi="Aptos" w:cs="Aptos"/>
+                <w:sz w:val="22"/>
+                <w:szCs w:val="22"/>
+              </w:rPr>
+              <w:t xml:space="preserve">ا 2 · ل 6 · م 6</w:t>
+            </w:r>
+          </w:p>
+        </w:tc>
+        <w:tc>
+          <w:tcPr>
+            <w:tcW w:w="3060" w:type="dxa"/>
             <w:vAlign w:val="center"/>
           </w:tcPr>
           <w:p>
@@ -2072,7 +2468,7 @@
         </w:trPr>
         <w:tc>
           <w:tcPr>
-            <w:tcW w:w="3000" w:type="dxa"/>
+            <w:tcW w:w="1960" w:type="dxa"/>
             <w:shd w:val="clear" w:color="auto" w:fill="DEEAF6"/>
             <w:vAlign w:val="center"/>
           </w:tcPr>
@@ -2103,7 +2499,55 @@
         </w:tc>
         <w:tc>
           <w:tcPr>
-            <w:tcW w:w="6360" w:type="dxa"/>
+            <w:tcW w:w="2360" w:type="dxa"/>
+            <w:vAlign w:val="center"/>
+          </w:tcPr>
+          <w:p>
+            <w:pPr>
+              <w:spacing w:before="60" w:after="60" w:line="240" w:lineRule="auto"/>
+              <w:rPr>
+                <w:rFonts w:ascii="Aptos" w:hAnsi="Aptos" w:cs="Aptos"/>
+                <w:sz w:val="22"/>
+                <w:szCs w:val="22"/>
+              </w:rPr>
+            </w:pPr>
+            <w:r>
+              <w:rPr>
+                <w:rFonts w:ascii="Aptos" w:hAnsi="Aptos" w:cs="Aptos"/>
+                <w:sz w:val="22"/>
+                <w:szCs w:val="22"/>
+              </w:rPr>
+              <w:t xml:space="preserve">Madd Lāzim Ḥarfī Muthaqqal</w:t>
+            </w:r>
+          </w:p>
+        </w:tc>
+        <w:tc>
+          <w:tcPr>
+            <w:tcW w:w="1980" w:type="dxa"/>
+            <w:vAlign w:val="center"/>
+          </w:tcPr>
+          <w:p>
+            <w:pPr>
+              <w:spacing w:before="60" w:after="60" w:line="240" w:lineRule="auto"/>
+              <w:rPr>
+                <w:rFonts w:ascii="Aptos" w:hAnsi="Aptos" w:cs="Aptos"/>
+                <w:sz w:val="22"/>
+                <w:szCs w:val="22"/>
+              </w:rPr>
+            </w:pPr>
+            <w:r>
+              <w:rPr>
+                <w:rFonts w:ascii="Aptos" w:hAnsi="Aptos" w:cs="Aptos"/>
+                <w:sz w:val="22"/>
+                <w:szCs w:val="22"/>
+              </w:rPr>
+              <w:t xml:space="preserve">ا 2 · ل 6 · م 6 · ص 6</w:t>
+            </w:r>
+          </w:p>
+        </w:tc>
+        <w:tc>
+          <w:tcPr>
+            <w:tcW w:w="3060" w:type="dxa"/>
             <w:shd w:val="clear" w:color="auto" w:fill="DEEAF6"/>
             <w:vAlign w:val="center"/>
           </w:tcPr>
@@ -2157,7 +2601,7 @@
         </w:trPr>
         <w:tc>
           <w:tcPr>
-            <w:tcW w:w="3000" w:type="dxa"/>
+            <w:tcW w:w="1960" w:type="dxa"/>
             <w:vAlign w:val="center"/>
           </w:tcPr>
           <w:p>
@@ -2187,7 +2631,55 @@
         </w:tc>
         <w:tc>
           <w:tcPr>
-            <w:tcW w:w="6360" w:type="dxa"/>
+            <w:tcW w:w="2360" w:type="dxa"/>
+            <w:vAlign w:val="center"/>
+          </w:tcPr>
+          <w:p>
+            <w:pPr>
+              <w:spacing w:before="60" w:after="60" w:line="240" w:lineRule="auto"/>
+              <w:rPr>
+                <w:rFonts w:ascii="Aptos" w:hAnsi="Aptos" w:cs="Aptos"/>
+                <w:sz w:val="22"/>
+                <w:szCs w:val="22"/>
+              </w:rPr>
+            </w:pPr>
+            <w:r>
+              <w:rPr>
+                <w:rFonts w:ascii="Aptos" w:hAnsi="Aptos" w:cs="Aptos"/>
+                <w:sz w:val="22"/>
+                <w:szCs w:val="22"/>
+              </w:rPr>
+              <w:t xml:space="preserve">Madd Lāzim Ḥarfī Mukhaffaf</w:t>
+            </w:r>
+          </w:p>
+        </w:tc>
+        <w:tc>
+          <w:tcPr>
+            <w:tcW w:w="1980" w:type="dxa"/>
+            <w:vAlign w:val="center"/>
+          </w:tcPr>
+          <w:p>
+            <w:pPr>
+              <w:spacing w:before="60" w:after="60" w:line="240" w:lineRule="auto"/>
+              <w:rPr>
+                <w:rFonts w:ascii="Aptos" w:hAnsi="Aptos" w:cs="Aptos"/>
+                <w:sz w:val="22"/>
+                <w:szCs w:val="22"/>
+              </w:rPr>
+            </w:pPr>
+            <w:r>
+              <w:rPr>
+                <w:rFonts w:ascii="Aptos" w:hAnsi="Aptos" w:cs="Aptos"/>
+                <w:sz w:val="22"/>
+                <w:szCs w:val="22"/>
+              </w:rPr>
+              <w:t xml:space="preserve">ا 2 · ل 6 · ر 2</w:t>
+            </w:r>
+          </w:p>
+        </w:tc>
+        <w:tc>
+          <w:tcPr>
+            <w:tcW w:w="3060" w:type="dxa"/>
             <w:vAlign w:val="center"/>
           </w:tcPr>
           <w:p>
@@ -2222,7 +2714,7 @@
         </w:trPr>
         <w:tc>
           <w:tcPr>
-            <w:tcW w:w="3000" w:type="dxa"/>
+            <w:tcW w:w="1960" w:type="dxa"/>
             <w:shd w:val="clear" w:color="auto" w:fill="DEEAF6"/>
             <w:vAlign w:val="center"/>
           </w:tcPr>
@@ -2253,7 +2745,55 @@
         </w:tc>
         <w:tc>
           <w:tcPr>
-            <w:tcW w:w="6360" w:type="dxa"/>
+            <w:tcW w:w="2360" w:type="dxa"/>
+            <w:vAlign w:val="center"/>
+          </w:tcPr>
+          <w:p>
+            <w:pPr>
+              <w:spacing w:before="60" w:after="60" w:line="240" w:lineRule="auto"/>
+              <w:rPr>
+                <w:rFonts w:ascii="Aptos" w:hAnsi="Aptos" w:cs="Aptos"/>
+                <w:sz w:val="22"/>
+                <w:szCs w:val="22"/>
+              </w:rPr>
+            </w:pPr>
+            <w:r>
+              <w:rPr>
+                <w:rFonts w:ascii="Aptos" w:hAnsi="Aptos" w:cs="Aptos"/>
+                <w:sz w:val="22"/>
+                <w:szCs w:val="22"/>
+              </w:rPr>
+              <w:t xml:space="preserve">Madd Lāzim Ḥarfī Muthaqqal</w:t>
+            </w:r>
+          </w:p>
+        </w:tc>
+        <w:tc>
+          <w:tcPr>
+            <w:tcW w:w="1980" w:type="dxa"/>
+            <w:vAlign w:val="center"/>
+          </w:tcPr>
+          <w:p>
+            <w:pPr>
+              <w:spacing w:before="60" w:after="60" w:line="240" w:lineRule="auto"/>
+              <w:rPr>
+                <w:rFonts w:ascii="Aptos" w:hAnsi="Aptos" w:cs="Aptos"/>
+                <w:sz w:val="22"/>
+                <w:szCs w:val="22"/>
+              </w:rPr>
+            </w:pPr>
+            <w:r>
+              <w:rPr>
+                <w:rFonts w:ascii="Aptos" w:hAnsi="Aptos" w:cs="Aptos"/>
+                <w:sz w:val="22"/>
+                <w:szCs w:val="22"/>
+              </w:rPr>
+              <w:t xml:space="preserve">ا 2 · ل 6 · م 6 · ر 2</w:t>
+            </w:r>
+          </w:p>
+        </w:tc>
+        <w:tc>
+          <w:tcPr>
+            <w:tcW w:w="3060" w:type="dxa"/>
             <w:shd w:val="clear" w:color="auto" w:fill="DEEAF6"/>
             <w:vAlign w:val="center"/>
           </w:tcPr>
@@ -2299,7 +2839,7 @@
         </w:trPr>
         <w:tc>
           <w:tcPr>
-            <w:tcW w:w="3000" w:type="dxa"/>
+            <w:tcW w:w="1960" w:type="dxa"/>
             <w:vAlign w:val="center"/>
           </w:tcPr>
           <w:p>
@@ -2329,7 +2869,55 @@
         </w:tc>
         <w:tc>
           <w:tcPr>
-            <w:tcW w:w="6360" w:type="dxa"/>
+            <w:tcW w:w="2360" w:type="dxa"/>
+            <w:vAlign w:val="center"/>
+          </w:tcPr>
+          <w:p>
+            <w:pPr>
+              <w:spacing w:before="60" w:after="60" w:line="240" w:lineRule="auto"/>
+              <w:rPr>
+                <w:rFonts w:ascii="Aptos" w:hAnsi="Aptos" w:cs="Aptos"/>
+                <w:sz w:val="22"/>
+                <w:szCs w:val="22"/>
+              </w:rPr>
+            </w:pPr>
+            <w:r>
+              <w:rPr>
+                <w:rFonts w:ascii="Aptos" w:hAnsi="Aptos" w:cs="Aptos"/>
+                <w:sz w:val="22"/>
+                <w:szCs w:val="22"/>
+              </w:rPr>
+              <w:t xml:space="preserve">Madd Lāzim Ḥarfī Mukhaffaf</w:t>
+            </w:r>
+          </w:p>
+        </w:tc>
+        <w:tc>
+          <w:tcPr>
+            <w:tcW w:w="1980" w:type="dxa"/>
+            <w:vAlign w:val="center"/>
+          </w:tcPr>
+          <w:p>
+            <w:pPr>
+              <w:spacing w:before="60" w:after="60" w:line="240" w:lineRule="auto"/>
+              <w:rPr>
+                <w:rFonts w:ascii="Aptos" w:hAnsi="Aptos" w:cs="Aptos"/>
+                <w:sz w:val="22"/>
+                <w:szCs w:val="22"/>
+              </w:rPr>
+            </w:pPr>
+            <w:r>
+              <w:rPr>
+                <w:rFonts w:ascii="Aptos" w:hAnsi="Aptos" w:cs="Aptos"/>
+                <w:sz w:val="22"/>
+                <w:szCs w:val="22"/>
+              </w:rPr>
+              <w:t xml:space="preserve">ك 6 · ه 2 · ي 2 · ع 6 · ص 6</w:t>
+            </w:r>
+          </w:p>
+        </w:tc>
+        <w:tc>
+          <w:tcPr>
+            <w:tcW w:w="3060" w:type="dxa"/>
             <w:vAlign w:val="center"/>
           </w:tcPr>
           <w:p>
@@ -2364,7 +2952,7 @@
         </w:trPr>
         <w:tc>
           <w:tcPr>
-            <w:tcW w:w="3000" w:type="dxa"/>
+            <w:tcW w:w="1960" w:type="dxa"/>
             <w:shd w:val="clear" w:color="auto" w:fill="DEEAF6"/>
             <w:vAlign w:val="center"/>
           </w:tcPr>
@@ -2395,7 +2983,55 @@
         </w:tc>
         <w:tc>
           <w:tcPr>
-            <w:tcW w:w="6360" w:type="dxa"/>
+            <w:tcW w:w="2360" w:type="dxa"/>
+            <w:vAlign w:val="center"/>
+          </w:tcPr>
+          <w:p>
+            <w:pPr>
+              <w:spacing w:before="60" w:after="60" w:line="240" w:lineRule="auto"/>
+              <w:rPr>
+                <w:rFonts w:ascii="Aptos" w:hAnsi="Aptos" w:cs="Aptos"/>
+                <w:sz w:val="22"/>
+                <w:szCs w:val="22"/>
+              </w:rPr>
+            </w:pPr>
+            <w:r>
+              <w:rPr>
+                <w:rFonts w:ascii="Aptos" w:hAnsi="Aptos" w:cs="Aptos"/>
+                <w:sz w:val="22"/>
+                <w:szCs w:val="22"/>
+              </w:rPr>
+              <w:t xml:space="preserve">Madd Lāzim Ḥarfī Muthaqqal</w:t>
+            </w:r>
+          </w:p>
+        </w:tc>
+        <w:tc>
+          <w:tcPr>
+            <w:tcW w:w="1980" w:type="dxa"/>
+            <w:vAlign w:val="center"/>
+          </w:tcPr>
+          <w:p>
+            <w:pPr>
+              <w:spacing w:before="60" w:after="60" w:line="240" w:lineRule="auto"/>
+              <w:rPr>
+                <w:rFonts w:ascii="Aptos" w:hAnsi="Aptos" w:cs="Aptos"/>
+                <w:sz w:val="22"/>
+                <w:szCs w:val="22"/>
+              </w:rPr>
+            </w:pPr>
+            <w:r>
+              <w:rPr>
+                <w:rFonts w:ascii="Aptos" w:hAnsi="Aptos" w:cs="Aptos"/>
+                <w:sz w:val="22"/>
+                <w:szCs w:val="22"/>
+              </w:rPr>
+              <w:t xml:space="preserve">ط 2 · س 6 · م 6</w:t>
+            </w:r>
+          </w:p>
+        </w:tc>
+        <w:tc>
+          <w:tcPr>
+            <w:tcW w:w="3060" w:type="dxa"/>
             <w:shd w:val="clear" w:color="auto" w:fill="DEEAF6"/>
             <w:vAlign w:val="center"/>
           </w:tcPr>
@@ -2449,7 +3085,7 @@
         </w:trPr>
         <w:tc>
           <w:tcPr>
-            <w:tcW w:w="3000" w:type="dxa"/>
+            <w:tcW w:w="1960" w:type="dxa"/>
             <w:vAlign w:val="center"/>
           </w:tcPr>
           <w:p>
@@ -2479,7 +3115,55 @@
         </w:tc>
         <w:tc>
           <w:tcPr>
-            <w:tcW w:w="6360" w:type="dxa"/>
+            <w:tcW w:w="2360" w:type="dxa"/>
+            <w:vAlign w:val="center"/>
+          </w:tcPr>
+          <w:p>
+            <w:pPr>
+              <w:spacing w:before="60" w:after="60" w:line="240" w:lineRule="auto"/>
+              <w:rPr>
+                <w:rFonts w:ascii="Aptos" w:hAnsi="Aptos" w:cs="Aptos"/>
+                <w:sz w:val="22"/>
+                <w:szCs w:val="22"/>
+              </w:rPr>
+            </w:pPr>
+            <w:r>
+              <w:rPr>
+                <w:rFonts w:ascii="Aptos" w:hAnsi="Aptos" w:cs="Aptos"/>
+                <w:sz w:val="22"/>
+                <w:szCs w:val="22"/>
+              </w:rPr>
+              <w:t xml:space="preserve">Madd Lāzim Ḥarfī Mukhaffaf</w:t>
+            </w:r>
+          </w:p>
+        </w:tc>
+        <w:tc>
+          <w:tcPr>
+            <w:tcW w:w="1980" w:type="dxa"/>
+            <w:vAlign w:val="center"/>
+          </w:tcPr>
+          <w:p>
+            <w:pPr>
+              <w:spacing w:before="60" w:after="60" w:line="240" w:lineRule="auto"/>
+              <w:rPr>
+                <w:rFonts w:ascii="Aptos" w:hAnsi="Aptos" w:cs="Aptos"/>
+                <w:sz w:val="22"/>
+                <w:szCs w:val="22"/>
+              </w:rPr>
+            </w:pPr>
+            <w:r>
+              <w:rPr>
+                <w:rFonts w:ascii="Aptos" w:hAnsi="Aptos" w:cs="Aptos"/>
+                <w:sz w:val="22"/>
+                <w:szCs w:val="22"/>
+              </w:rPr>
+              <w:t xml:space="preserve">ط 2 · س 6</w:t>
+            </w:r>
+          </w:p>
+        </w:tc>
+        <w:tc>
+          <w:tcPr>
+            <w:tcW w:w="3060" w:type="dxa"/>
             <w:vAlign w:val="center"/>
           </w:tcPr>
           <w:p>
@@ -2532,7 +3216,7 @@
         </w:trPr>
         <w:tc>
           <w:tcPr>
-            <w:tcW w:w="3000" w:type="dxa"/>
+            <w:tcW w:w="1960" w:type="dxa"/>
             <w:shd w:val="clear" w:color="auto" w:fill="DEEAF6"/>
             <w:vAlign w:val="center"/>
           </w:tcPr>
@@ -2563,7 +3247,55 @@
         </w:tc>
         <w:tc>
           <w:tcPr>
-            <w:tcW w:w="6360" w:type="dxa"/>
+            <w:tcW w:w="2360" w:type="dxa"/>
+            <w:vAlign w:val="center"/>
+          </w:tcPr>
+          <w:p>
+            <w:pPr>
+              <w:spacing w:before="60" w:after="60" w:line="240" w:lineRule="auto"/>
+              <w:rPr>
+                <w:rFonts w:ascii="Aptos" w:hAnsi="Aptos" w:cs="Aptos"/>
+                <w:sz w:val="22"/>
+                <w:szCs w:val="22"/>
+              </w:rPr>
+            </w:pPr>
+            <w:r>
+              <w:rPr>
+                <w:rFonts w:ascii="Aptos" w:hAnsi="Aptos" w:cs="Aptos"/>
+                <w:sz w:val="22"/>
+                <w:szCs w:val="22"/>
+              </w:rPr>
+              <w:t xml:space="preserve">Madd Lāzim Ḥarfī Mukhaffaf</w:t>
+            </w:r>
+          </w:p>
+        </w:tc>
+        <w:tc>
+          <w:tcPr>
+            <w:tcW w:w="1980" w:type="dxa"/>
+            <w:vAlign w:val="center"/>
+          </w:tcPr>
+          <w:p>
+            <w:pPr>
+              <w:spacing w:before="60" w:after="60" w:line="240" w:lineRule="auto"/>
+              <w:rPr>
+                <w:rFonts w:ascii="Aptos" w:hAnsi="Aptos" w:cs="Aptos"/>
+                <w:sz w:val="22"/>
+                <w:szCs w:val="22"/>
+              </w:rPr>
+            </w:pPr>
+            <w:r>
+              <w:rPr>
+                <w:rFonts w:ascii="Aptos" w:hAnsi="Aptos" w:cs="Aptos"/>
+                <w:sz w:val="22"/>
+                <w:szCs w:val="22"/>
+              </w:rPr>
+              <w:t xml:space="preserve">ي 2 · س 6</w:t>
+            </w:r>
+          </w:p>
+        </w:tc>
+        <w:tc>
+          <w:tcPr>
+            <w:tcW w:w="3060" w:type="dxa"/>
             <w:shd w:val="clear" w:color="auto" w:fill="DEEAF6"/>
             <w:vAlign w:val="center"/>
           </w:tcPr>
@@ -2609,7 +3341,7 @@
         </w:trPr>
         <w:tc>
           <w:tcPr>
-            <w:tcW w:w="3000" w:type="dxa"/>
+            <w:tcW w:w="1960" w:type="dxa"/>
             <w:vAlign w:val="center"/>
           </w:tcPr>
           <w:p>
@@ -2639,7 +3371,55 @@
         </w:tc>
         <w:tc>
           <w:tcPr>
-            <w:tcW w:w="6360" w:type="dxa"/>
+            <w:tcW w:w="2360" w:type="dxa"/>
+            <w:vAlign w:val="center"/>
+          </w:tcPr>
+          <w:p>
+            <w:pPr>
+              <w:spacing w:before="60" w:after="60" w:line="240" w:lineRule="auto"/>
+              <w:rPr>
+                <w:rFonts w:ascii="Aptos" w:hAnsi="Aptos" w:cs="Aptos"/>
+                <w:sz w:val="22"/>
+                <w:szCs w:val="22"/>
+              </w:rPr>
+            </w:pPr>
+            <w:r>
+              <w:rPr>
+                <w:rFonts w:ascii="Aptos" w:hAnsi="Aptos" w:cs="Aptos"/>
+                <w:sz w:val="22"/>
+                <w:szCs w:val="22"/>
+              </w:rPr>
+              <w:t xml:space="preserve">Madd Lāzim Ḥarfī Mukhaffaf</w:t>
+            </w:r>
+          </w:p>
+        </w:tc>
+        <w:tc>
+          <w:tcPr>
+            <w:tcW w:w="1980" w:type="dxa"/>
+            <w:vAlign w:val="center"/>
+          </w:tcPr>
+          <w:p>
+            <w:pPr>
+              <w:spacing w:before="60" w:after="60" w:line="240" w:lineRule="auto"/>
+              <w:rPr>
+                <w:rFonts w:ascii="Aptos" w:hAnsi="Aptos" w:cs="Aptos"/>
+                <w:sz w:val="22"/>
+                <w:szCs w:val="22"/>
+              </w:rPr>
+            </w:pPr>
+            <w:r>
+              <w:rPr>
+                <w:rFonts w:ascii="Aptos" w:hAnsi="Aptos" w:cs="Aptos"/>
+                <w:sz w:val="22"/>
+                <w:szCs w:val="22"/>
+              </w:rPr>
+              <w:t xml:space="preserve">6 ḥarakāt each</w:t>
+            </w:r>
+          </w:p>
+        </w:tc>
+        <w:tc>
+          <w:tcPr>
+            <w:tcW w:w="3060" w:type="dxa"/>
             <w:vAlign w:val="center"/>
           </w:tcPr>
           <w:p>
@@ -2684,7 +3464,7 @@
         </w:trPr>
         <w:tc>
           <w:tcPr>
-            <w:tcW w:w="3000" w:type="dxa"/>
+            <w:tcW w:w="1960" w:type="dxa"/>
             <w:shd w:val="clear" w:color="auto" w:fill="DEEAF6"/>
             <w:vAlign w:val="center"/>
           </w:tcPr>
@@ -2735,7 +3515,55 @@
         </w:tc>
         <w:tc>
           <w:tcPr>
-            <w:tcW w:w="6360" w:type="dxa"/>
+            <w:tcW w:w="2360" w:type="dxa"/>
+            <w:vAlign w:val="center"/>
+          </w:tcPr>
+          <w:p>
+            <w:pPr>
+              <w:spacing w:before="60" w:after="60" w:line="240" w:lineRule="auto"/>
+              <w:rPr>
+                <w:rFonts w:ascii="Aptos" w:hAnsi="Aptos" w:cs="Aptos"/>
+                <w:sz w:val="22"/>
+                <w:szCs w:val="22"/>
+              </w:rPr>
+            </w:pPr>
+            <w:r>
+              <w:rPr>
+                <w:rFonts w:ascii="Aptos" w:hAnsi="Aptos" w:cs="Aptos"/>
+                <w:sz w:val="22"/>
+                <w:szCs w:val="22"/>
+              </w:rPr>
+              <w:t xml:space="preserve">Madd Lāzim Ḥarfī Mukhaffaf</w:t>
+            </w:r>
+          </w:p>
+        </w:tc>
+        <w:tc>
+          <w:tcPr>
+            <w:tcW w:w="1980" w:type="dxa"/>
+            <w:vAlign w:val="center"/>
+          </w:tcPr>
+          <w:p>
+            <w:pPr>
+              <w:spacing w:before="60" w:after="60" w:line="240" w:lineRule="auto"/>
+              <w:rPr>
+                <w:rFonts w:ascii="Aptos" w:hAnsi="Aptos" w:cs="Aptos"/>
+                <w:sz w:val="22"/>
+                <w:szCs w:val="22"/>
+              </w:rPr>
+            </w:pPr>
+            <w:r>
+              <w:rPr>
+                <w:rFonts w:ascii="Aptos" w:hAnsi="Aptos" w:cs="Aptos"/>
+                <w:sz w:val="22"/>
+                <w:szCs w:val="22"/>
+              </w:rPr>
+              <w:t xml:space="preserve">ح 2 · م 6 · ع 6 · س 6 · ق 6</w:t>
+            </w:r>
+          </w:p>
+        </w:tc>
+        <w:tc>
+          <w:tcPr>
+            <w:tcW w:w="3060" w:type="dxa"/>
             <w:shd w:val="clear" w:color="auto" w:fill="DEEAF6"/>
             <w:vAlign w:val="center"/>
           </w:tcPr>
@@ -2789,7 +3617,7 @@
         </w:trPr>
         <w:tc>
           <w:tcPr>
-            <w:tcW w:w="3000" w:type="dxa"/>
+            <w:tcW w:w="1960" w:type="dxa"/>
             <w:vAlign w:val="center"/>
           </w:tcPr>
           <w:p>
@@ -2819,7 +3647,55 @@
         </w:tc>
         <w:tc>
           <w:tcPr>
-            <w:tcW w:w="6360" w:type="dxa"/>
+            <w:tcW w:w="2360" w:type="dxa"/>
+            <w:vAlign w:val="center"/>
+          </w:tcPr>
+          <w:p>
+            <w:pPr>
+              <w:spacing w:before="60" w:after="60" w:line="240" w:lineRule="auto"/>
+              <w:rPr>
+                <w:rFonts w:ascii="Aptos" w:hAnsi="Aptos" w:cs="Aptos"/>
+                <w:sz w:val="22"/>
+                <w:szCs w:val="22"/>
+              </w:rPr>
+            </w:pPr>
+            <w:r>
+              <w:rPr>
+                <w:rFonts w:ascii="Aptos" w:hAnsi="Aptos" w:cs="Aptos"/>
+                <w:sz w:val="22"/>
+                <w:szCs w:val="22"/>
+              </w:rPr>
+              <w:t xml:space="preserve">Madd Lāzim Ḥarfī Mukhaffaf</w:t>
+            </w:r>
+          </w:p>
+        </w:tc>
+        <w:tc>
+          <w:tcPr>
+            <w:tcW w:w="1980" w:type="dxa"/>
+            <w:vAlign w:val="center"/>
+          </w:tcPr>
+          <w:p>
+            <w:pPr>
+              <w:spacing w:before="60" w:after="60" w:line="240" w:lineRule="auto"/>
+              <w:rPr>
+                <w:rFonts w:ascii="Aptos" w:hAnsi="Aptos" w:cs="Aptos"/>
+                <w:sz w:val="22"/>
+                <w:szCs w:val="22"/>
+              </w:rPr>
+            </w:pPr>
+            <w:r>
+              <w:rPr>
+                <w:rFonts w:ascii="Aptos" w:hAnsi="Aptos" w:cs="Aptos"/>
+                <w:sz w:val="22"/>
+                <w:szCs w:val="22"/>
+              </w:rPr>
+              <w:t xml:space="preserve">6 ḥarakāt each</w:t>
+            </w:r>
+          </w:p>
+        </w:tc>
+        <w:tc>
+          <w:tcPr>
+            <w:tcW w:w="3060" w:type="dxa"/>
             <w:vAlign w:val="center"/>
           </w:tcPr>
           <w:p>
@@ -2955,9 +3831,10 @@
         <w:tblLook w:val="0000" w:firstRow="0" w:lastRow="0" w:firstColumn="0" w:lastColumn="0" w:noHBand="0" w:noVBand="0"/>
       </w:tblPr>
       <w:tblGrid>
-        <w:gridCol w:w="2960"/>
-        <w:gridCol w:w="3160"/>
-        <w:gridCol w:w="3240"/>
+        <w:gridCol w:w="1960"/>
+        <w:gridCol w:w="2360"/>
+        <w:gridCol w:w="1980"/>
+        <w:gridCol w:w="3060"/>
       </w:tblGrid>
       <w:tr>
         <w:tblPrEx>
@@ -2972,7 +3849,7 @@
         </w:trPr>
         <w:tc>
           <w:tcPr>
-            <w:tcW w:w="2960" w:type="dxa"/>
+            <w:tcW w:w="1960" w:type="dxa"/>
             <w:shd w:val="clear" w:color="auto" w:fill="2F5496"/>
             <w:vAlign w:val="center"/>
           </w:tcPr>
@@ -2999,7 +3876,7 @@
         </w:tc>
         <w:tc>
           <w:tcPr>
-            <w:tcW w:w="3160" w:type="dxa"/>
+            <w:tcW w:w="2360" w:type="dxa"/>
             <w:shd w:val="clear" w:color="auto" w:fill="2F5496"/>
             <w:vAlign w:val="center"/>
           </w:tcPr>
@@ -3026,7 +3903,34 @@
         </w:tc>
         <w:tc>
           <w:tcPr>
-            <w:tcW w:w="3240" w:type="dxa"/>
+            <w:tcW w:w="1980" w:type="dxa"/>
+            <w:shd w:val="clear" w:color="auto" w:fill="2F5496"/>
+            <w:vAlign w:val="center"/>
+          </w:tcPr>
+          <w:p>
+            <w:pPr>
+              <w:spacing w:before="60" w:after="60"/>
+              <w:rPr>
+                <w:rFonts w:ascii="Aptos" w:hAnsi="Aptos" w:cs="Aptos"/>
+                <w:b/>
+                <w:bCs/>
+                <w:color w:val="FFFFFF"/>
+              </w:rPr>
+            </w:pPr>
+            <w:r>
+              <w:rPr>
+                <w:rFonts w:ascii="Aptos" w:hAnsi="Aptos" w:cs="Aptos"/>
+                <w:b/>
+                <w:bCs/>
+                <w:color w:val="FFFFFF"/>
+              </w:rPr>
+              <w:t xml:space="preserve">Length</w:t>
+            </w:r>
+          </w:p>
+        </w:tc>
+        <w:tc>
+          <w:tcPr>
+            <w:tcW w:w="3060" w:type="dxa"/>
             <w:shd w:val="clear" w:color="auto" w:fill="2F5496"/>
             <w:vAlign w:val="center"/>
           </w:tcPr>
@@ -3064,7 +3968,7 @@
         </w:trPr>
         <w:tc>
           <w:tcPr>
-            <w:tcW w:w="2960" w:type="dxa"/>
+            <w:tcW w:w="1960" w:type="dxa"/>
             <w:vAlign w:val="center"/>
           </w:tcPr>
           <w:p>
@@ -3103,7 +4007,7 @@
         </w:tc>
         <w:tc>
           <w:tcPr>
-            <w:tcW w:w="3160" w:type="dxa"/>
+            <w:tcW w:w="2360" w:type="dxa"/>
             <w:vAlign w:val="center"/>
           </w:tcPr>
           <w:p>
@@ -3183,7 +4087,31 @@
         </w:tc>
         <w:tc>
           <w:tcPr>
-            <w:tcW w:w="3240" w:type="dxa"/>
+            <w:tcW w:w="1980" w:type="dxa"/>
+            <w:vAlign w:val="center"/>
+          </w:tcPr>
+          <w:p>
+            <w:pPr>
+              <w:spacing w:before="60" w:after="60" w:line="240" w:lineRule="auto"/>
+              <w:rPr>
+                <w:rFonts w:ascii="Aptos" w:hAnsi="Aptos" w:cs="Aptos"/>
+                <w:sz w:val="22"/>
+                <w:szCs w:val="22"/>
+              </w:rPr>
+            </w:pPr>
+            <w:r>
+              <w:rPr>
+                <w:rFonts w:ascii="Aptos" w:hAnsi="Aptos" w:cs="Aptos"/>
+                <w:sz w:val="22"/>
+                <w:szCs w:val="22"/>
+              </w:rPr>
+              <w:t xml:space="preserve">2 ḥarakāt</w:t>
+            </w:r>
+          </w:p>
+        </w:tc>
+        <w:tc>
+          <w:tcPr>
+            <w:tcW w:w="3060" w:type="dxa"/>
             <w:vAlign w:val="center"/>
           </w:tcPr>
           <w:p>
@@ -3252,7 +4180,7 @@
         </w:trPr>
         <w:tc>
           <w:tcPr>
-            <w:tcW w:w="2960" w:type="dxa"/>
+            <w:tcW w:w="1960" w:type="dxa"/>
             <w:shd w:val="clear" w:color="auto" w:fill="DEEAF6"/>
             <w:vAlign w:val="center"/>
           </w:tcPr>
@@ -3323,7 +4251,7 @@
         </w:tc>
         <w:tc>
           <w:tcPr>
-            <w:tcW w:w="3160" w:type="dxa"/>
+            <w:tcW w:w="2360" w:type="dxa"/>
             <w:shd w:val="clear" w:color="auto" w:fill="DEEAF6"/>
             <w:vAlign w:val="center"/>
           </w:tcPr>
@@ -3404,7 +4332,31 @@
         </w:tc>
         <w:tc>
           <w:tcPr>
-            <w:tcW w:w="3240" w:type="dxa"/>
+            <w:tcW w:w="1980" w:type="dxa"/>
+            <w:vAlign w:val="center"/>
+          </w:tcPr>
+          <w:p>
+            <w:pPr>
+              <w:spacing w:before="60" w:after="60" w:line="240" w:lineRule="auto"/>
+              <w:rPr>
+                <w:rFonts w:ascii="Aptos" w:hAnsi="Aptos" w:cs="Aptos"/>
+                <w:sz w:val="22"/>
+                <w:szCs w:val="22"/>
+              </w:rPr>
+            </w:pPr>
+            <w:r>
+              <w:rPr>
+                <w:rFonts w:ascii="Aptos" w:hAnsi="Aptos" w:cs="Aptos"/>
+                <w:sz w:val="22"/>
+                <w:szCs w:val="22"/>
+              </w:rPr>
+              <w:t xml:space="preserve">2 ḥarakāt</w:t>
+            </w:r>
+          </w:p>
+        </w:tc>
+        <w:tc>
+          <w:tcPr>
+            <w:tcW w:w="3060" w:type="dxa"/>
             <w:shd w:val="clear" w:color="auto" w:fill="DEEAF6"/>
             <w:vAlign w:val="center"/>
           </w:tcPr>
@@ -3474,7 +4426,7 @@
         </w:trPr>
         <w:tc>
           <w:tcPr>
-            <w:tcW w:w="2960" w:type="dxa"/>
+            <w:tcW w:w="1960" w:type="dxa"/>
             <w:vAlign w:val="center"/>
           </w:tcPr>
           <w:p>
@@ -3524,7 +4476,7 @@
         </w:tc>
         <w:tc>
           <w:tcPr>
-            <w:tcW w:w="3160" w:type="dxa"/>
+            <w:tcW w:w="2360" w:type="dxa"/>
             <w:vAlign w:val="center"/>
           </w:tcPr>
           <w:p>
@@ -3604,7 +4556,31 @@
         </w:tc>
         <w:tc>
           <w:tcPr>
-            <w:tcW w:w="3240" w:type="dxa"/>
+            <w:tcW w:w="1980" w:type="dxa"/>
+            <w:vAlign w:val="center"/>
+          </w:tcPr>
+          <w:p>
+            <w:pPr>
+              <w:spacing w:before="60" w:after="60" w:line="240" w:lineRule="auto"/>
+              <w:rPr>
+                <w:rFonts w:ascii="Aptos" w:hAnsi="Aptos" w:cs="Aptos"/>
+                <w:sz w:val="22"/>
+                <w:szCs w:val="22"/>
+              </w:rPr>
+            </w:pPr>
+            <w:r>
+              <w:rPr>
+                <w:rFonts w:ascii="Aptos" w:hAnsi="Aptos" w:cs="Aptos"/>
+                <w:sz w:val="22"/>
+                <w:szCs w:val="22"/>
+              </w:rPr>
+              <w:t xml:space="preserve">2 ḥarakāt</w:t>
+            </w:r>
+          </w:p>
+        </w:tc>
+        <w:tc>
+          <w:tcPr>
+            <w:tcW w:w="3060" w:type="dxa"/>
             <w:vAlign w:val="center"/>
           </w:tcPr>
           <w:p>
@@ -3655,7 +4631,7 @@
         </w:trPr>
         <w:tc>
           <w:tcPr>
-            <w:tcW w:w="2960" w:type="dxa"/>
+            <w:tcW w:w="1960" w:type="dxa"/>
             <w:shd w:val="clear" w:color="auto" w:fill="DEEAF6"/>
             <w:vAlign w:val="center"/>
           </w:tcPr>
@@ -3695,7 +4671,7 @@
         </w:tc>
         <w:tc>
           <w:tcPr>
-            <w:tcW w:w="3160" w:type="dxa"/>
+            <w:tcW w:w="2360" w:type="dxa"/>
             <w:shd w:val="clear" w:color="auto" w:fill="DEEAF6"/>
             <w:vAlign w:val="center"/>
           </w:tcPr>
@@ -3776,7 +4752,31 @@
         </w:tc>
         <w:tc>
           <w:tcPr>
-            <w:tcW w:w="3240" w:type="dxa"/>
+            <w:tcW w:w="1980" w:type="dxa"/>
+            <w:vAlign w:val="center"/>
+          </w:tcPr>
+          <w:p>
+            <w:pPr>
+              <w:spacing w:before="60" w:after="60" w:line="240" w:lineRule="auto"/>
+              <w:rPr>
+                <w:rFonts w:ascii="Aptos" w:hAnsi="Aptos" w:cs="Aptos"/>
+                <w:sz w:val="22"/>
+                <w:szCs w:val="22"/>
+              </w:rPr>
+            </w:pPr>
+            <w:r>
+              <w:rPr>
+                <w:rFonts w:ascii="Aptos" w:hAnsi="Aptos" w:cs="Aptos"/>
+                <w:sz w:val="22"/>
+                <w:szCs w:val="22"/>
+              </w:rPr>
+              <w:t xml:space="preserve">2 ḥarakāt</w:t>
+            </w:r>
+          </w:p>
+        </w:tc>
+        <w:tc>
+          <w:tcPr>
+            <w:tcW w:w="3060" w:type="dxa"/>
             <w:shd w:val="clear" w:color="auto" w:fill="DEEAF6"/>
             <w:vAlign w:val="center"/>
           </w:tcPr>
@@ -3848,7 +4848,7 @@
         </w:trPr>
         <w:tc>
           <w:tcPr>
-            <w:tcW w:w="2960" w:type="dxa"/>
+            <w:tcW w:w="1960" w:type="dxa"/>
             <w:vAlign w:val="center"/>
           </w:tcPr>
           <w:p>
@@ -3898,7 +4898,7 @@
         </w:tc>
         <w:tc>
           <w:tcPr>
-            <w:tcW w:w="3160" w:type="dxa"/>
+            <w:tcW w:w="2360" w:type="dxa"/>
             <w:vAlign w:val="center"/>
           </w:tcPr>
           <w:p>
@@ -3978,7 +4978,31 @@
         </w:tc>
         <w:tc>
           <w:tcPr>
-            <w:tcW w:w="3240" w:type="dxa"/>
+            <w:tcW w:w="1980" w:type="dxa"/>
+            <w:vAlign w:val="center"/>
+          </w:tcPr>
+          <w:p>
+            <w:pPr>
+              <w:spacing w:before="60" w:after="60" w:line="240" w:lineRule="auto"/>
+              <w:rPr>
+                <w:rFonts w:ascii="Aptos" w:hAnsi="Aptos" w:cs="Aptos"/>
+                <w:sz w:val="22"/>
+                <w:szCs w:val="22"/>
+              </w:rPr>
+            </w:pPr>
+            <w:r>
+              <w:rPr>
+                <w:rFonts w:ascii="Aptos" w:hAnsi="Aptos" w:cs="Aptos"/>
+                <w:sz w:val="22"/>
+                <w:szCs w:val="22"/>
+              </w:rPr>
+              <w:t xml:space="preserve">2 ḥarakāt</w:t>
+            </w:r>
+          </w:p>
+        </w:tc>
+        <w:tc>
+          <w:tcPr>
+            <w:tcW w:w="3060" w:type="dxa"/>
             <w:vAlign w:val="center"/>
           </w:tcPr>
           <w:p>
@@ -4065,7 +5089,7 @@
         </w:trPr>
         <w:tc>
           <w:tcPr>
-            <w:tcW w:w="2960" w:type="dxa"/>
+            <w:tcW w:w="1960" w:type="dxa"/>
             <w:shd w:val="clear" w:color="auto" w:fill="DEEAF6"/>
             <w:vAlign w:val="center"/>
           </w:tcPr>
@@ -4105,7 +5129,7 @@
         </w:tc>
         <w:tc>
           <w:tcPr>
-            <w:tcW w:w="3160" w:type="dxa"/>
+            <w:tcW w:w="2360" w:type="dxa"/>
             <w:shd w:val="clear" w:color="auto" w:fill="DEEAF6"/>
             <w:vAlign w:val="center"/>
           </w:tcPr>
@@ -4186,7 +5210,31 @@
         </w:tc>
         <w:tc>
           <w:tcPr>
-            <w:tcW w:w="3240" w:type="dxa"/>
+            <w:tcW w:w="1980" w:type="dxa"/>
+            <w:vAlign w:val="center"/>
+          </w:tcPr>
+          <w:p>
+            <w:pPr>
+              <w:spacing w:before="60" w:after="60" w:line="240" w:lineRule="auto"/>
+              <w:rPr>
+                <w:rFonts w:ascii="Aptos" w:hAnsi="Aptos" w:cs="Aptos"/>
+                <w:sz w:val="22"/>
+                <w:szCs w:val="22"/>
+              </w:rPr>
+            </w:pPr>
+            <w:r>
+              <w:rPr>
+                <w:rFonts w:ascii="Aptos" w:hAnsi="Aptos" w:cs="Aptos"/>
+                <w:sz w:val="22"/>
+                <w:szCs w:val="22"/>
+              </w:rPr>
+              <w:t xml:space="preserve">2 ḥarakāt</w:t>
+            </w:r>
+          </w:p>
+        </w:tc>
+        <w:tc>
+          <w:tcPr>
+            <w:tcW w:w="3060" w:type="dxa"/>
             <w:shd w:val="clear" w:color="auto" w:fill="DEEAF6"/>
             <w:vAlign w:val="center"/>
           </w:tcPr>
@@ -4258,7 +5306,7 @@
         </w:trPr>
         <w:tc>
           <w:tcPr>
-            <w:tcW w:w="2960" w:type="dxa"/>
+            <w:tcW w:w="1960" w:type="dxa"/>
             <w:vAlign w:val="center"/>
           </w:tcPr>
           <w:p>
@@ -4308,7 +5356,7 @@
         </w:tc>
         <w:tc>
           <w:tcPr>
-            <w:tcW w:w="3160" w:type="dxa"/>
+            <w:tcW w:w="2360" w:type="dxa"/>
             <w:vAlign w:val="center"/>
           </w:tcPr>
           <w:p>
@@ -4388,7 +5436,31 @@
         </w:tc>
         <w:tc>
           <w:tcPr>
-            <w:tcW w:w="3240" w:type="dxa"/>
+            <w:tcW w:w="1980" w:type="dxa"/>
+            <w:vAlign w:val="center"/>
+          </w:tcPr>
+          <w:p>
+            <w:pPr>
+              <w:spacing w:before="60" w:after="60" w:line="240" w:lineRule="auto"/>
+              <w:rPr>
+                <w:rFonts w:ascii="Aptos" w:hAnsi="Aptos" w:cs="Aptos"/>
+                <w:sz w:val="22"/>
+                <w:szCs w:val="22"/>
+              </w:rPr>
+            </w:pPr>
+            <w:r>
+              <w:rPr>
+                <w:rFonts w:ascii="Aptos" w:hAnsi="Aptos" w:cs="Aptos"/>
+                <w:sz w:val="22"/>
+                <w:szCs w:val="22"/>
+              </w:rPr>
+              <w:t xml:space="preserve">2 ḥarakāt</w:t>
+            </w:r>
+          </w:p>
+        </w:tc>
+        <w:tc>
+          <w:tcPr>
+            <w:tcW w:w="3060" w:type="dxa"/>
             <w:vAlign w:val="center"/>
           </w:tcPr>
           <w:p>
@@ -4535,9 +5607,10 @@
         <w:tblLook w:val="04A0" w:firstRow="1" w:lastRow="0" w:firstColumn="1" w:lastColumn="0" w:noHBand="0" w:noVBand="1"/>
       </w:tblPr>
       <w:tblGrid>
-        <w:gridCol w:w="2960"/>
-        <w:gridCol w:w="3160"/>
-        <w:gridCol w:w="3240"/>
+        <w:gridCol w:w="1960"/>
+        <w:gridCol w:w="2360"/>
+        <w:gridCol w:w="1980"/>
+        <w:gridCol w:w="3060"/>
       </w:tblGrid>
       <w:tr>
         <w:tblPrEx>
@@ -4552,7 +5625,7 @@
         </w:trPr>
         <w:tc>
           <w:tcPr>
-            <w:tcW w:w="2960" w:type="dxa"/>
+            <w:tcW w:w="1960" w:type="dxa"/>
             <w:shd w:val="clear" w:color="auto" w:fill="2F5496"/>
             <w:vAlign w:val="center"/>
           </w:tcPr>
@@ -4579,7 +5652,7 @@
         </w:tc>
         <w:tc>
           <w:tcPr>
-            <w:tcW w:w="3160" w:type="dxa"/>
+            <w:tcW w:w="2360" w:type="dxa"/>
             <w:shd w:val="clear" w:color="auto" w:fill="2F5496"/>
             <w:vAlign w:val="center"/>
           </w:tcPr>
@@ -4606,7 +5679,34 @@
         </w:tc>
         <w:tc>
           <w:tcPr>
-            <w:tcW w:w="3240" w:type="dxa"/>
+            <w:tcW w:w="1980" w:type="dxa"/>
+            <w:shd w:val="clear" w:color="auto" w:fill="2F5496"/>
+            <w:vAlign w:val="center"/>
+          </w:tcPr>
+          <w:p>
+            <w:pPr>
+              <w:spacing w:before="60" w:after="60"/>
+              <w:rPr>
+                <w:rFonts w:ascii="Aptos" w:hAnsi="Aptos" w:cs="Aptos"/>
+                <w:b/>
+                <w:bCs/>
+                <w:color w:val="FFFFFF"/>
+              </w:rPr>
+            </w:pPr>
+            <w:r>
+              <w:rPr>
+                <w:rFonts w:ascii="Aptos" w:hAnsi="Aptos" w:cs="Aptos"/>
+                <w:b/>
+                <w:bCs/>
+                <w:color w:val="FFFFFF"/>
+              </w:rPr>
+              <w:t xml:space="preserve">Length</w:t>
+            </w:r>
+          </w:p>
+        </w:tc>
+        <w:tc>
+          <w:tcPr>
+            <w:tcW w:w="3060" w:type="dxa"/>
             <w:shd w:val="clear" w:color="auto" w:fill="2F5496"/>
             <w:vAlign w:val="center"/>
           </w:tcPr>
@@ -4644,7 +5744,7 @@
         </w:trPr>
         <w:tc>
           <w:tcPr>
-            <w:tcW w:w="2960" w:type="dxa"/>
+            <w:tcW w:w="1960" w:type="dxa"/>
             <w:vAlign w:val="center"/>
           </w:tcPr>
           <w:p>
@@ -4694,7 +5794,7 @@
         </w:tc>
         <w:tc>
           <w:tcPr>
-            <w:tcW w:w="3160" w:type="dxa"/>
+            <w:tcW w:w="2360" w:type="dxa"/>
             <w:vAlign w:val="center"/>
           </w:tcPr>
           <w:p>
@@ -4756,7 +5856,31 @@
         </w:tc>
         <w:tc>
           <w:tcPr>
-            <w:tcW w:w="3240" w:type="dxa"/>
+            <w:tcW w:w="1980" w:type="dxa"/>
+            <w:vAlign w:val="center"/>
+          </w:tcPr>
+          <w:p>
+            <w:pPr>
+              <w:spacing w:before="60" w:after="60" w:line="240" w:lineRule="auto"/>
+              <w:rPr>
+                <w:rFonts w:ascii="Aptos" w:hAnsi="Aptos" w:cs="Aptos"/>
+                <w:sz w:val="22"/>
+                <w:szCs w:val="22"/>
+              </w:rPr>
+            </w:pPr>
+            <w:r>
+              <w:rPr>
+                <w:rFonts w:ascii="Aptos" w:hAnsi="Aptos" w:cs="Aptos"/>
+                <w:sz w:val="22"/>
+                <w:szCs w:val="22"/>
+              </w:rPr>
+              <w:t xml:space="preserve">4 ḥarakāt</w:t>
+            </w:r>
+          </w:p>
+        </w:tc>
+        <w:tc>
+          <w:tcPr>
+            <w:tcW w:w="3060" w:type="dxa"/>
             <w:vAlign w:val="center"/>
           </w:tcPr>
           <w:p>
@@ -4835,7 +5959,7 @@
         </w:trPr>
         <w:tc>
           <w:tcPr>
-            <w:tcW w:w="2960" w:type="dxa"/>
+            <w:tcW w:w="1960" w:type="dxa"/>
             <w:shd w:val="clear" w:color="auto" w:fill="DEEAF6"/>
             <w:vAlign w:val="center"/>
           </w:tcPr>
@@ -4886,7 +6010,7 @@
         </w:tc>
         <w:tc>
           <w:tcPr>
-            <w:tcW w:w="3160" w:type="dxa"/>
+            <w:tcW w:w="2360" w:type="dxa"/>
             <w:shd w:val="clear" w:color="auto" w:fill="DEEAF6"/>
             <w:vAlign w:val="center"/>
           </w:tcPr>
@@ -4949,7 +6073,31 @@
         </w:tc>
         <w:tc>
           <w:tcPr>
-            <w:tcW w:w="3240" w:type="dxa"/>
+            <w:tcW w:w="1980" w:type="dxa"/>
+            <w:vAlign w:val="center"/>
+          </w:tcPr>
+          <w:p>
+            <w:pPr>
+              <w:spacing w:before="60" w:after="60" w:line="240" w:lineRule="auto"/>
+              <w:rPr>
+                <w:rFonts w:ascii="Aptos" w:hAnsi="Aptos" w:cs="Aptos"/>
+                <w:sz w:val="22"/>
+                <w:szCs w:val="22"/>
+              </w:rPr>
+            </w:pPr>
+            <w:r>
+              <w:rPr>
+                <w:rFonts w:ascii="Aptos" w:hAnsi="Aptos" w:cs="Aptos"/>
+                <w:sz w:val="22"/>
+                <w:szCs w:val="22"/>
+              </w:rPr>
+              <w:t xml:space="preserve">4 ḥarakāt</w:t>
+            </w:r>
+          </w:p>
+        </w:tc>
+        <w:tc>
+          <w:tcPr>
+            <w:tcW w:w="3060" w:type="dxa"/>
             <w:shd w:val="clear" w:color="auto" w:fill="DEEAF6"/>
             <w:vAlign w:val="center"/>
           </w:tcPr>
@@ -5011,7 +6159,7 @@
         </w:trPr>
         <w:tc>
           <w:tcPr>
-            <w:tcW w:w="2960" w:type="dxa"/>
+            <w:tcW w:w="1960" w:type="dxa"/>
             <w:vAlign w:val="center"/>
           </w:tcPr>
           <w:p>
@@ -5050,7 +6198,7 @@
         </w:tc>
         <w:tc>
           <w:tcPr>
-            <w:tcW w:w="3160" w:type="dxa"/>
+            <w:tcW w:w="2360" w:type="dxa"/>
             <w:vAlign w:val="center"/>
           </w:tcPr>
           <w:p>
@@ -5112,7 +6260,31 @@
         </w:tc>
         <w:tc>
           <w:tcPr>
-            <w:tcW w:w="3240" w:type="dxa"/>
+            <w:tcW w:w="1980" w:type="dxa"/>
+            <w:vAlign w:val="center"/>
+          </w:tcPr>
+          <w:p>
+            <w:pPr>
+              <w:spacing w:before="60" w:after="60" w:line="240" w:lineRule="auto"/>
+              <w:rPr>
+                <w:rFonts w:ascii="Aptos" w:hAnsi="Aptos" w:cs="Aptos"/>
+                <w:sz w:val="22"/>
+                <w:szCs w:val="22"/>
+              </w:rPr>
+            </w:pPr>
+            <w:r>
+              <w:rPr>
+                <w:rFonts w:ascii="Aptos" w:hAnsi="Aptos" w:cs="Aptos"/>
+                <w:sz w:val="22"/>
+                <w:szCs w:val="22"/>
+              </w:rPr>
+              <w:t xml:space="preserve">4 ḥarakāt</w:t>
+            </w:r>
+          </w:p>
+        </w:tc>
+        <w:tc>
+          <w:tcPr>
+            <w:tcW w:w="3060" w:type="dxa"/>
             <w:vAlign w:val="center"/>
           </w:tcPr>
           <w:p>
@@ -5197,7 +6369,7 @@
         </w:trPr>
         <w:tc>
           <w:tcPr>
-            <w:tcW w:w="2960" w:type="dxa"/>
+            <w:tcW w:w="1960" w:type="dxa"/>
             <w:shd w:val="clear" w:color="auto" w:fill="DEEAF6"/>
             <w:vAlign w:val="center"/>
           </w:tcPr>
@@ -5248,7 +6420,7 @@
         </w:tc>
         <w:tc>
           <w:tcPr>
-            <w:tcW w:w="3160" w:type="dxa"/>
+            <w:tcW w:w="2360" w:type="dxa"/>
             <w:shd w:val="clear" w:color="auto" w:fill="DEEAF6"/>
             <w:vAlign w:val="center"/>
           </w:tcPr>
@@ -5311,7 +6483,31 @@
         </w:tc>
         <w:tc>
           <w:tcPr>
-            <w:tcW w:w="3240" w:type="dxa"/>
+            <w:tcW w:w="1980" w:type="dxa"/>
+            <w:vAlign w:val="center"/>
+          </w:tcPr>
+          <w:p>
+            <w:pPr>
+              <w:spacing w:before="60" w:after="60" w:line="240" w:lineRule="auto"/>
+              <w:rPr>
+                <w:rFonts w:ascii="Aptos" w:hAnsi="Aptos" w:cs="Aptos"/>
+                <w:sz w:val="22"/>
+                <w:szCs w:val="22"/>
+              </w:rPr>
+            </w:pPr>
+            <w:r>
+              <w:rPr>
+                <w:rFonts w:ascii="Aptos" w:hAnsi="Aptos" w:cs="Aptos"/>
+                <w:sz w:val="22"/>
+                <w:szCs w:val="22"/>
+              </w:rPr>
+              <w:t xml:space="preserve">4 ḥarakāt</w:t>
+            </w:r>
+          </w:p>
+        </w:tc>
+        <w:tc>
+          <w:tcPr>
+            <w:tcW w:w="3060" w:type="dxa"/>
             <w:shd w:val="clear" w:color="auto" w:fill="DEEAF6"/>
             <w:vAlign w:val="center"/>
           </w:tcPr>
@@ -5381,7 +6577,7 @@
         </w:trPr>
         <w:tc>
           <w:tcPr>
-            <w:tcW w:w="2960" w:type="dxa"/>
+            <w:tcW w:w="1960" w:type="dxa"/>
             <w:vAlign w:val="center"/>
           </w:tcPr>
           <w:p>
@@ -5431,7 +6627,7 @@
         </w:tc>
         <w:tc>
           <w:tcPr>
-            <w:tcW w:w="3160" w:type="dxa"/>
+            <w:tcW w:w="2360" w:type="dxa"/>
             <w:vAlign w:val="center"/>
           </w:tcPr>
           <w:p>
@@ -5493,7 +6689,31 @@
         </w:tc>
         <w:tc>
           <w:tcPr>
-            <w:tcW w:w="3240" w:type="dxa"/>
+            <w:tcW w:w="1980" w:type="dxa"/>
+            <w:vAlign w:val="center"/>
+          </w:tcPr>
+          <w:p>
+            <w:pPr>
+              <w:spacing w:before="60" w:after="60" w:line="240" w:lineRule="auto"/>
+              <w:rPr>
+                <w:rFonts w:ascii="Aptos" w:hAnsi="Aptos" w:cs="Aptos"/>
+                <w:sz w:val="22"/>
+                <w:szCs w:val="22"/>
+              </w:rPr>
+            </w:pPr>
+            <w:r>
+              <w:rPr>
+                <w:rFonts w:ascii="Aptos" w:hAnsi="Aptos" w:cs="Aptos"/>
+                <w:sz w:val="22"/>
+                <w:szCs w:val="22"/>
+              </w:rPr>
+              <w:t xml:space="preserve">4 ḥarakāt</w:t>
+            </w:r>
+          </w:p>
+        </w:tc>
+        <w:tc>
+          <w:tcPr>
+            <w:tcW w:w="3060" w:type="dxa"/>
             <w:vAlign w:val="center"/>
           </w:tcPr>
           <w:p>
@@ -5570,7 +6790,7 @@
         </w:trPr>
         <w:tc>
           <w:tcPr>
-            <w:tcW w:w="2960" w:type="dxa"/>
+            <w:tcW w:w="1960" w:type="dxa"/>
             <w:shd w:val="clear" w:color="auto" w:fill="DEEAF6"/>
             <w:vAlign w:val="center"/>
           </w:tcPr>
@@ -5621,7 +6841,7 @@
         </w:tc>
         <w:tc>
           <w:tcPr>
-            <w:tcW w:w="3160" w:type="dxa"/>
+            <w:tcW w:w="2360" w:type="dxa"/>
             <w:shd w:val="clear" w:color="auto" w:fill="DEEAF6"/>
             <w:vAlign w:val="center"/>
           </w:tcPr>
@@ -5684,7 +6904,31 @@
         </w:tc>
         <w:tc>
           <w:tcPr>
-            <w:tcW w:w="3240" w:type="dxa"/>
+            <w:tcW w:w="1980" w:type="dxa"/>
+            <w:vAlign w:val="center"/>
+          </w:tcPr>
+          <w:p>
+            <w:pPr>
+              <w:spacing w:before="60" w:after="60" w:line="240" w:lineRule="auto"/>
+              <w:rPr>
+                <w:rFonts w:ascii="Aptos" w:hAnsi="Aptos" w:cs="Aptos"/>
+                <w:sz w:val="22"/>
+                <w:szCs w:val="22"/>
+              </w:rPr>
+            </w:pPr>
+            <w:r>
+              <w:rPr>
+                <w:rFonts w:ascii="Aptos" w:hAnsi="Aptos" w:cs="Aptos"/>
+                <w:sz w:val="22"/>
+                <w:szCs w:val="22"/>
+              </w:rPr>
+              <w:t xml:space="preserve">4 ḥarakāt</w:t>
+            </w:r>
+          </w:p>
+        </w:tc>
+        <w:tc>
+          <w:tcPr>
+            <w:tcW w:w="3060" w:type="dxa"/>
             <w:shd w:val="clear" w:color="auto" w:fill="DEEAF6"/>
             <w:vAlign w:val="center"/>
           </w:tcPr>
@@ -5754,7 +6998,7 @@
         </w:trPr>
         <w:tc>
           <w:tcPr>
-            <w:tcW w:w="2960" w:type="dxa"/>
+            <w:tcW w:w="1960" w:type="dxa"/>
             <w:vAlign w:val="center"/>
           </w:tcPr>
           <w:p>
@@ -5793,7 +7037,7 @@
         </w:tc>
         <w:tc>
           <w:tcPr>
-            <w:tcW w:w="3160" w:type="dxa"/>
+            <w:tcW w:w="2360" w:type="dxa"/>
             <w:vAlign w:val="center"/>
           </w:tcPr>
           <w:p>
@@ -5855,7 +7099,31 @@
         </w:tc>
         <w:tc>
           <w:tcPr>
-            <w:tcW w:w="3240" w:type="dxa"/>
+            <w:tcW w:w="1980" w:type="dxa"/>
+            <w:vAlign w:val="center"/>
+          </w:tcPr>
+          <w:p>
+            <w:pPr>
+              <w:spacing w:before="60" w:after="60" w:line="240" w:lineRule="auto"/>
+              <w:rPr>
+                <w:rFonts w:ascii="Aptos" w:hAnsi="Aptos" w:cs="Aptos"/>
+                <w:sz w:val="22"/>
+                <w:szCs w:val="22"/>
+              </w:rPr>
+            </w:pPr>
+            <w:r>
+              <w:rPr>
+                <w:rFonts w:ascii="Aptos" w:hAnsi="Aptos" w:cs="Aptos"/>
+                <w:sz w:val="22"/>
+                <w:szCs w:val="22"/>
+              </w:rPr>
+              <w:t xml:space="preserve">4 ḥarakāt</w:t>
+            </w:r>
+          </w:p>
+        </w:tc>
+        <w:tc>
+          <w:tcPr>
+            <w:tcW w:w="3060" w:type="dxa"/>
             <w:vAlign w:val="center"/>
           </w:tcPr>
           <w:p>
@@ -5964,7 +7232,7 @@
           <w:szCs w:val="28"/>
         </w:rPr>
         <w:lastRenderedPageBreak/>
-        <w:t>Other Types of Madd</w:t>
+        <w:t xml:space="preserve">Madd Badal, ʿIwaḍ and Līn</w:t>
       </w:r>
     </w:p>
     <w:tbl>
@@ -6049,7 +7317,7 @@
                 <w:bCs/>
                 <w:color w:val="FFFFFF"/>
               </w:rPr>
-              <w:t>Name of Madd</w:t>
+              <w:t xml:space="preserve">Type of Madd</w:t>
             </w:r>
           </w:p>
         </w:tc>
@@ -6103,7 +7371,7 @@
                 <w:bCs/>
                 <w:color w:val="FFFFFF"/>
               </w:rPr>
-              <w:t>Meaning &amp; Location</w:t>
+              <w:t xml:space="preserve">Meaning (Sahih International)</w:t>
             </w:r>
           </w:p>
         </w:tc>
@@ -6423,6 +7691,7 @@
         <w:tc>
           <w:tcPr>
             <w:tcW w:w="1960" w:type="dxa"/>
+            <w:shd w:val="clear" w:color="auto" w:fill="DEEAF6"/>
             <w:vAlign w:val="center"/>
           </w:tcPr>
           <w:p>
@@ -6445,7 +7714,7 @@
                 <w:szCs w:val="44"/>
                 <w:rtl/>
               </w:rPr>
-              <w:t>ٱلرَّحِيمِ</w:t>
+              <w:t>خَوۡفٍ</w:t>
             </w:r>
             <w:proofErr w:type="spellEnd"/>
           </w:p>
@@ -6453,6 +7722,7 @@
         <w:tc>
           <w:tcPr>
             <w:tcW w:w="2360" w:type="dxa"/>
+            <w:shd w:val="clear" w:color="auto" w:fill="DEEAF6"/>
             <w:vAlign w:val="center"/>
           </w:tcPr>
           <w:p>
@@ -6479,25 +7749,7 @@
                 <w:sz w:val="22"/>
                 <w:szCs w:val="22"/>
               </w:rPr>
-              <w:t>ʿĀriḍ</w:t>
-            </w:r>
-            <w:proofErr w:type="spellEnd"/>
-            <w:r>
-              <w:rPr>
-                <w:rFonts w:ascii="Aptos" w:hAnsi="Aptos" w:cs="Aptos"/>
-                <w:sz w:val="22"/>
-                <w:szCs w:val="22"/>
-              </w:rPr>
-              <w:t xml:space="preserve"> li‑s‑</w:t>
-            </w:r>
-            <w:proofErr w:type="spellStart"/>
-            <w:r>
-              <w:rPr>
-                <w:rFonts w:ascii="Aptos" w:hAnsi="Aptos" w:cs="Aptos"/>
-                <w:sz w:val="22"/>
-                <w:szCs w:val="22"/>
-              </w:rPr>
-              <w:t>Sukūn</w:t>
+              <w:t>Līn</w:t>
             </w:r>
             <w:proofErr w:type="spellEnd"/>
           </w:p>
@@ -6505,104 +7757,50 @@
         <w:tc>
           <w:tcPr>
             <w:tcW w:w="1980" w:type="dxa"/>
-            <w:vAlign w:val="center"/>
-          </w:tcPr>
-          <w:p>
-            <w:pPr>
-              <w:spacing w:before="60" w:after="60" w:line="240" w:lineRule="auto"/>
-              <w:rPr>
-                <w:rFonts w:ascii="Aptos" w:hAnsi="Aptos" w:cs="Aptos"/>
-                <w:sz w:val="22"/>
-                <w:szCs w:val="22"/>
-              </w:rPr>
-            </w:pPr>
-            <w:r>
-              <w:rPr>
-                <w:rFonts w:ascii="Aptos" w:hAnsi="Aptos" w:cs="Aptos"/>
-                <w:sz w:val="22"/>
-                <w:szCs w:val="22"/>
-              </w:rPr>
-              <w:t xml:space="preserve">2, 4 or 6 </w:t>
-            </w:r>
-            <w:proofErr w:type="spellStart"/>
-            <w:r>
-              <w:rPr>
-                <w:rFonts w:ascii="Aptos" w:hAnsi="Aptos" w:cs="Aptos"/>
-                <w:sz w:val="22"/>
-                <w:szCs w:val="22"/>
-              </w:rPr>
-              <w:t>ḥarakāt</w:t>
-            </w:r>
-            <w:proofErr w:type="spellEnd"/>
-            <w:r>
-              <w:rPr>
-                <w:rFonts w:ascii="Aptos" w:hAnsi="Aptos" w:cs="Aptos"/>
-                <w:sz w:val="22"/>
-                <w:szCs w:val="22"/>
-              </w:rPr>
-              <w:t xml:space="preserve"> (at waqf only)</w:t>
+            <w:shd w:val="clear" w:color="auto" w:fill="DEEAF6"/>
+            <w:vAlign w:val="center"/>
+          </w:tcPr>
+          <w:p>
+            <w:pPr>
+              <w:spacing w:before="60" w:after="60" w:line="240" w:lineRule="auto"/>
+              <w:rPr>
+                <w:rFonts w:ascii="Aptos" w:hAnsi="Aptos" w:cs="Aptos"/>
+                <w:sz w:val="22"/>
+                <w:szCs w:val="22"/>
+              </w:rPr>
+            </w:pPr>
+            <w:r>
+              <w:rPr>
+                <w:rFonts w:ascii="Aptos" w:hAnsi="Aptos" w:cs="Aptos"/>
+                <w:sz w:val="22"/>
+                <w:szCs w:val="22"/>
+              </w:rPr>
+              <w:t xml:space="preserve">2 ḥarakāt (recitation continues)</w:t>
             </w:r>
           </w:p>
         </w:tc>
         <w:tc>
           <w:tcPr>
             <w:tcW w:w="3060" w:type="dxa"/>
-            <w:vAlign w:val="center"/>
-          </w:tcPr>
-          <w:p>
-            <w:pPr>
-              <w:spacing w:before="60" w:after="60" w:line="240" w:lineRule="auto"/>
-              <w:rPr>
-                <w:rFonts w:ascii="Aptos" w:hAnsi="Aptos" w:cs="Aptos"/>
-                <w:sz w:val="22"/>
-                <w:szCs w:val="22"/>
-              </w:rPr>
-            </w:pPr>
-            <w:r>
-              <w:rPr>
-                <w:rFonts w:ascii="Aptos" w:hAnsi="Aptos" w:cs="Aptos"/>
-                <w:sz w:val="22"/>
-                <w:szCs w:val="22"/>
-              </w:rPr>
-              <w:t>“</w:t>
-            </w:r>
-            <w:proofErr w:type="spellStart"/>
-            <w:proofErr w:type="gramStart"/>
-            <w:r>
-              <w:rPr>
-                <w:rFonts w:ascii="Aptos" w:hAnsi="Aptos" w:cs="Aptos"/>
-                <w:sz w:val="22"/>
-                <w:szCs w:val="22"/>
-              </w:rPr>
-              <w:t>the</w:t>
-            </w:r>
-            <w:proofErr w:type="spellEnd"/>
-            <w:proofErr w:type="gramEnd"/>
-            <w:r>
-              <w:rPr>
-                <w:rFonts w:ascii="Aptos" w:hAnsi="Aptos" w:cs="Aptos"/>
-                <w:sz w:val="22"/>
-                <w:szCs w:val="22"/>
-              </w:rPr>
-              <w:t xml:space="preserve"> Especially Merciful” — Al‑</w:t>
-            </w:r>
-            <w:proofErr w:type="spellStart"/>
-            <w:r>
-              <w:rPr>
-                <w:rFonts w:ascii="Aptos" w:hAnsi="Aptos" w:cs="Aptos"/>
-                <w:sz w:val="22"/>
-                <w:szCs w:val="22"/>
-              </w:rPr>
-              <w:t>Fātiḥah</w:t>
-            </w:r>
-            <w:proofErr w:type="spellEnd"/>
-            <w:r>
-              <w:rPr>
-                <w:rFonts w:ascii="Aptos" w:hAnsi="Aptos" w:cs="Aptos"/>
-                <w:sz w:val="22"/>
-                <w:szCs w:val="22"/>
-              </w:rPr>
-              <w:t> 1:3</w:t>
+            <w:shd w:val="clear" w:color="auto" w:fill="DEEAF6"/>
+            <w:vAlign w:val="center"/>
+          </w:tcPr>
+          <w:p>
+            <w:pPr>
+              <w:spacing w:before="60" w:after="60" w:line="240" w:lineRule="auto"/>
+              <w:rPr>
+                <w:rFonts w:ascii="Aptos" w:hAnsi="Aptos" w:cs="Aptos"/>
+                <w:sz w:val="22"/>
+                <w:szCs w:val="22"/>
+              </w:rPr>
+            </w:pPr>
+            <w:r>
+              <w:rPr>
+                <w:rFonts w:ascii="Aptos" w:hAnsi="Aptos" w:cs="Aptos"/>
+                <w:sz w:val="22"/>
+                <w:szCs w:val="22"/>
+              </w:rPr>
+              <w:t>“fear” — Quraysh 106:4</w:t>
             </w:r>
           </w:p>
         </w:tc>
@@ -6620,7 +7818,6 @@
         <w:tc>
           <w:tcPr>
             <w:tcW w:w="1960" w:type="dxa"/>
-            <w:shd w:val="clear" w:color="auto" w:fill="DEEAF6"/>
             <w:vAlign w:val="center"/>
           </w:tcPr>
           <w:p>
@@ -6643,7 +7840,7 @@
                 <w:szCs w:val="44"/>
                 <w:rtl/>
               </w:rPr>
-              <w:t>خَوۡفٍ</w:t>
+              <w:t>ٱلصَّيۡفِ</w:t>
             </w:r>
             <w:proofErr w:type="spellEnd"/>
           </w:p>
@@ -6651,7 +7848,6 @@
         <w:tc>
           <w:tcPr>
             <w:tcW w:w="2360" w:type="dxa"/>
-            <w:shd w:val="clear" w:color="auto" w:fill="DEEAF6"/>
             <w:vAlign w:val="center"/>
           </w:tcPr>
           <w:p>
@@ -6686,72 +7882,127 @@
         <w:tc>
           <w:tcPr>
             <w:tcW w:w="1980" w:type="dxa"/>
-            <w:shd w:val="clear" w:color="auto" w:fill="DEEAF6"/>
-            <w:vAlign w:val="center"/>
-          </w:tcPr>
-          <w:p>
-            <w:pPr>
-              <w:spacing w:before="60" w:after="60" w:line="240" w:lineRule="auto"/>
-              <w:rPr>
-                <w:rFonts w:ascii="Aptos" w:hAnsi="Aptos" w:cs="Aptos"/>
-                <w:sz w:val="22"/>
-                <w:szCs w:val="22"/>
-              </w:rPr>
-            </w:pPr>
-            <w:r>
-              <w:rPr>
-                <w:rFonts w:ascii="Aptos" w:hAnsi="Aptos" w:cs="Aptos"/>
-                <w:sz w:val="22"/>
-                <w:szCs w:val="22"/>
-              </w:rPr>
-              <w:t xml:space="preserve">2, 4 or 6 </w:t>
-            </w:r>
-            <w:proofErr w:type="spellStart"/>
-            <w:r>
-              <w:rPr>
-                <w:rFonts w:ascii="Aptos" w:hAnsi="Aptos" w:cs="Aptos"/>
-                <w:sz w:val="22"/>
-                <w:szCs w:val="22"/>
-              </w:rPr>
-              <w:t>ḥarakāt</w:t>
-            </w:r>
-            <w:proofErr w:type="spellEnd"/>
-            <w:r>
-              <w:rPr>
-                <w:rFonts w:ascii="Aptos" w:hAnsi="Aptos" w:cs="Aptos"/>
-                <w:sz w:val="22"/>
-                <w:szCs w:val="22"/>
-              </w:rPr>
-              <w:t xml:space="preserve"> (at waqf only)</w:t>
+            <w:vAlign w:val="center"/>
+          </w:tcPr>
+          <w:p>
+            <w:pPr>
+              <w:spacing w:before="60" w:after="60" w:line="240" w:lineRule="auto"/>
+              <w:rPr>
+                <w:rFonts w:ascii="Aptos" w:hAnsi="Aptos" w:cs="Aptos"/>
+                <w:sz w:val="22"/>
+                <w:szCs w:val="22"/>
+              </w:rPr>
+            </w:pPr>
+            <w:r>
+              <w:rPr>
+                <w:rFonts w:ascii="Aptos" w:hAnsi="Aptos" w:cs="Aptos"/>
+                <w:sz w:val="22"/>
+                <w:szCs w:val="22"/>
+              </w:rPr>
+              <w:t xml:space="preserve">2 ḥarakāt (recitation continues)</w:t>
             </w:r>
           </w:p>
         </w:tc>
         <w:tc>
           <w:tcPr>
             <w:tcW w:w="3060" w:type="dxa"/>
-            <w:shd w:val="clear" w:color="auto" w:fill="DEEAF6"/>
-            <w:vAlign w:val="center"/>
-          </w:tcPr>
-          <w:p>
-            <w:pPr>
-              <w:spacing w:before="60" w:after="60" w:line="240" w:lineRule="auto"/>
-              <w:rPr>
-                <w:rFonts w:ascii="Aptos" w:hAnsi="Aptos" w:cs="Aptos"/>
-                <w:sz w:val="22"/>
-                <w:szCs w:val="22"/>
-              </w:rPr>
-            </w:pPr>
-            <w:r>
-              <w:rPr>
-                <w:rFonts w:ascii="Aptos" w:hAnsi="Aptos" w:cs="Aptos"/>
-                <w:sz w:val="22"/>
-                <w:szCs w:val="22"/>
-              </w:rPr>
-              <w:t>“fear” — Quraysh 106:4</w:t>
+            <w:vAlign w:val="center"/>
+          </w:tcPr>
+          <w:p>
+            <w:pPr>
+              <w:spacing w:before="60" w:after="60" w:line="240" w:lineRule="auto"/>
+              <w:rPr>
+                <w:rFonts w:ascii="Aptos" w:hAnsi="Aptos" w:cs="Aptos"/>
+                <w:sz w:val="22"/>
+                <w:szCs w:val="22"/>
+              </w:rPr>
+            </w:pPr>
+            <w:r>
+              <w:rPr>
+                <w:rFonts w:ascii="Aptos" w:hAnsi="Aptos" w:cs="Aptos"/>
+                <w:sz w:val="22"/>
+                <w:szCs w:val="22"/>
+              </w:rPr>
+              <w:t>“</w:t>
+            </w:r>
+            <w:proofErr w:type="gramStart"/>
+            <w:r>
+              <w:rPr>
+                <w:rFonts w:ascii="Aptos" w:hAnsi="Aptos" w:cs="Aptos"/>
+                <w:sz w:val="22"/>
+                <w:szCs w:val="22"/>
+              </w:rPr>
+              <w:t>the</w:t>
+            </w:r>
+            <w:proofErr w:type="gramEnd"/>
+            <w:r>
+              <w:rPr>
+                <w:rFonts w:ascii="Aptos" w:hAnsi="Aptos" w:cs="Aptos"/>
+                <w:sz w:val="22"/>
+                <w:szCs w:val="22"/>
+              </w:rPr>
+              <w:t xml:space="preserve"> summer” — Quraysh 106:2</w:t>
             </w:r>
           </w:p>
         </w:tc>
       </w:tr>
+    </w:tbl>
+    <w:p>
+      <w:pPr>
+        <w:spacing w:after="120"/>
+        <w:rPr>
+          <w:rFonts w:ascii="Aptos" w:hAnsi="Aptos" w:cs="Aptos"/>
+          <w:b/>
+          <w:bCs/>
+          <w:color w:val="2F5496"/>
+          <w:sz w:val="28"/>
+          <w:szCs w:val="28"/>
+        </w:rPr>
+      </w:pPr>
+      <w:r>
+        <w:rPr>
+          <w:rFonts w:ascii="Aptos" w:hAnsi="Aptos" w:cs="Aptos"/>
+          <w:b/>
+          <w:bCs/>
+          <w:color w:val="2F5496"/>
+          <w:sz w:val="28"/>
+          <w:szCs w:val="28"/>
+        </w:rPr>
+        <w:br w:type="page"/>
+      </w:r>
+      <w:r>
+        <w:rPr>
+          <w:rFonts w:ascii="Aptos" w:hAnsi="Aptos" w:cs="Aptos"/>
+          <w:b/>
+          <w:bCs/>
+          <w:color w:val="2F5496"/>
+          <w:sz w:val="28"/>
+          <w:szCs w:val="28"/>
+        </w:rPr>
+        <w:t xml:space="preserve">Madd ʿĀriḍ li-s-Sukūn</w:t>
+      </w:r>
+    </w:p>
+    <w:tbl>
+      <w:tblPr>
+        <w:tblW w:w="9360" w:type="dxa"/>
+        <w:tblInd w:w="-8" w:type="dxa"/>
+        <w:tblBorders>
+          <w:top w:val="single" w:sz="6" w:space="0" w:color="8EAADB"/>
+          <w:left w:val="single" w:sz="6" w:space="0" w:color="8EAADB"/>
+          <w:bottom w:val="single" w:sz="6" w:space="0" w:color="8EAADB"/>
+          <w:right w:val="single" w:sz="6" w:space="0" w:color="8EAADB"/>
+          <w:insideH w:val="single" w:sz="6" w:space="0" w:color="8EAADB"/>
+          <w:insideV w:val="single" w:sz="6" w:space="0" w:color="8EAADB"/>
+        </w:tblBorders>
+        <w:tblLayout w:type="fixed"/>
+        <w:tblLook w:val="0000" w:firstRow="0" w:lastRow="0" w:firstColumn="0" w:lastColumn="0" w:noHBand="0" w:noVBand="0"/>
+      </w:tblPr>
+      <w:tblGrid>
+        <w:gridCol w:w="1960"/>
+        <w:gridCol w:w="2360"/>
+        <w:gridCol w:w="1980"/>
+        <w:gridCol w:w="3060"/>
+      </w:tblGrid>
       <w:tr>
         <w:tblPrEx>
           <w:tblCellMar>
@@ -6761,6 +8012,120 @@
         </w:tblPrEx>
         <w:trPr>
           <w:cantSplit/>
+          <w:tblHeader/>
+        </w:trPr>
+        <w:tc>
+          <w:tcPr>
+            <w:tcW w:w="1960" w:type="dxa"/>
+            <w:shd w:val="clear" w:color="auto" w:fill="2F5496"/>
+            <w:vAlign w:val="center"/>
+          </w:tcPr>
+          <w:p>
+            <w:pPr>
+              <w:spacing w:before="60" w:after="60"/>
+              <w:rPr>
+                <w:rFonts w:ascii="Aptos" w:hAnsi="Aptos" w:cs="Aptos"/>
+                <w:b/>
+                <w:bCs/>
+                <w:color w:val="FFFFFF"/>
+              </w:rPr>
+            </w:pPr>
+            <w:r>
+              <w:rPr>
+                <w:rFonts w:ascii="Aptos" w:hAnsi="Aptos" w:cs="Aptos"/>
+                <w:b/>
+                <w:bCs/>
+                <w:color w:val="FFFFFF"/>
+              </w:rPr>
+              <w:t xml:space="preserve">Word</w:t>
+            </w:r>
+          </w:p>
+        </w:tc>
+        <w:tc>
+          <w:tcPr>
+            <w:tcW w:w="2360" w:type="dxa"/>
+            <w:shd w:val="clear" w:color="auto" w:fill="2F5496"/>
+            <w:vAlign w:val="center"/>
+          </w:tcPr>
+          <w:p>
+            <w:pPr>
+              <w:spacing w:before="60" w:after="60"/>
+              <w:rPr>
+                <w:rFonts w:ascii="Aptos" w:hAnsi="Aptos" w:cs="Aptos"/>
+                <w:b/>
+                <w:bCs/>
+                <w:color w:val="FFFFFF"/>
+              </w:rPr>
+            </w:pPr>
+            <w:r>
+              <w:rPr>
+                <w:rFonts w:ascii="Aptos" w:hAnsi="Aptos" w:cs="Aptos"/>
+                <w:b/>
+                <w:bCs/>
+                <w:color w:val="FFFFFF"/>
+              </w:rPr>
+              <w:t xml:space="preserve">Type of Madd</w:t>
+            </w:r>
+          </w:p>
+        </w:tc>
+        <w:tc>
+          <w:tcPr>
+            <w:tcW w:w="1980" w:type="dxa"/>
+            <w:shd w:val="clear" w:color="auto" w:fill="2F5496"/>
+            <w:vAlign w:val="center"/>
+          </w:tcPr>
+          <w:p>
+            <w:pPr>
+              <w:spacing w:before="60" w:after="60"/>
+              <w:rPr>
+                <w:rFonts w:ascii="Aptos" w:hAnsi="Aptos" w:cs="Aptos"/>
+                <w:b/>
+                <w:bCs/>
+                <w:color w:val="FFFFFF"/>
+              </w:rPr>
+            </w:pPr>
+            <w:r>
+              <w:rPr>
+                <w:rFonts w:ascii="Aptos" w:hAnsi="Aptos" w:cs="Aptos"/>
+                <w:b/>
+                <w:bCs/>
+                <w:color w:val="FFFFFF"/>
+              </w:rPr>
+              <w:t xml:space="preserve">Length</w:t>
+            </w:r>
+          </w:p>
+        </w:tc>
+        <w:tc>
+          <w:tcPr>
+            <w:tcW w:w="3060" w:type="dxa"/>
+            <w:shd w:val="clear" w:color="auto" w:fill="2F5496"/>
+            <w:vAlign w:val="center"/>
+          </w:tcPr>
+          <w:p>
+            <w:pPr>
+              <w:spacing w:before="60" w:after="60"/>
+              <w:rPr>
+                <w:rFonts w:ascii="Aptos" w:hAnsi="Aptos" w:cs="Aptos"/>
+                <w:b/>
+                <w:bCs/>
+                <w:color w:val="FFFFFF"/>
+              </w:rPr>
+            </w:pPr>
+            <w:r>
+              <w:rPr>
+                <w:rFonts w:ascii="Aptos" w:hAnsi="Aptos" w:cs="Aptos"/>
+                <w:b/>
+                <w:bCs/>
+                <w:color w:val="FFFFFF"/>
+              </w:rPr>
+              <w:t xml:space="preserve">Meaning (Sahih International)</w:t>
+            </w:r>
+          </w:p>
+        </w:tc>
+      </w:tr>
+      <w:tr>
+        <w:trPr>
+          <w:cantSplit/>
         </w:trPr>
         <w:tc>
           <w:tcPr>
@@ -6779,7 +8144,6 @@
                 <w:rtl/>
               </w:rPr>
             </w:pPr>
-            <w:proofErr w:type="spellStart"/>
             <w:r>
               <w:rPr>
                 <w:rFonts w:ascii="KFGQPC HAFS Uthmanic Script" w:hAnsi="KFGQPC HAFS Uthmanic Script" w:cs="KFGQPC HAFS Uthmanic Script"/>
@@ -6787,9 +8151,8 @@
                 <w:szCs w:val="44"/>
                 <w:rtl/>
               </w:rPr>
-              <w:t>ٱلصَّيۡفِ</w:t>
-            </w:r>
-            <w:proofErr w:type="spellEnd"/>
+              <w:t xml:space="preserve">ٱلۡقُرۡءَانُ وقف</w:t>
+            </w:r>
           </w:p>
         </w:tc>
         <w:tc>
@@ -6812,18 +8175,8 @@
                 <w:sz w:val="22"/>
                 <w:szCs w:val="22"/>
               </w:rPr>
-              <w:t xml:space="preserve">Madd </w:t>
-            </w:r>
-            <w:proofErr w:type="spellStart"/>
-            <w:r>
-              <w:rPr>
-                <w:rFonts w:ascii="Aptos" w:hAnsi="Aptos" w:cs="Aptos"/>
-                <w:sz w:val="22"/>
-                <w:szCs w:val="22"/>
-              </w:rPr>
-              <w:t>Līn</w:t>
-            </w:r>
-            <w:proofErr w:type="spellEnd"/>
+              <w:t xml:space="preserve">Madd ʿĀriḍ li-s-Sukūn</w:t>
+            </w:r>
           </w:p>
         </w:tc>
         <w:tc>
@@ -6846,25 +8199,7 @@
                 <w:sz w:val="22"/>
                 <w:szCs w:val="22"/>
               </w:rPr>
-              <w:t xml:space="preserve">2, 4 or 6 </w:t>
-            </w:r>
-            <w:proofErr w:type="spellStart"/>
-            <w:r>
-              <w:rPr>
-                <w:rFonts w:ascii="Aptos" w:hAnsi="Aptos" w:cs="Aptos"/>
-                <w:sz w:val="22"/>
-                <w:szCs w:val="22"/>
-              </w:rPr>
-              <w:t>ḥarakāt</w:t>
-            </w:r>
-            <w:proofErr w:type="spellEnd"/>
-            <w:r>
-              <w:rPr>
-                <w:rFonts w:ascii="Aptos" w:hAnsi="Aptos" w:cs="Aptos"/>
-                <w:sz w:val="22"/>
-                <w:szCs w:val="22"/>
-              </w:rPr>
-              <w:t xml:space="preserve"> (at waqf only)</w:t>
+              <w:t xml:space="preserve">2, 4 or 6 ḥarakāt (at waqf) — one take, said three ways: 2, then 4, then 6</w:t>
             </w:r>
           </w:p>
         </w:tc>
@@ -6888,25 +8223,322 @@
                 <w:sz w:val="22"/>
                 <w:szCs w:val="22"/>
               </w:rPr>
-              <w:t>“</w:t>
-            </w:r>
-            <w:proofErr w:type="gramStart"/>
-            <w:r>
-              <w:rPr>
-                <w:rFonts w:ascii="Aptos" w:hAnsi="Aptos" w:cs="Aptos"/>
-                <w:sz w:val="22"/>
-                <w:szCs w:val="22"/>
-              </w:rPr>
-              <w:t>the</w:t>
-            </w:r>
-            <w:proofErr w:type="gramEnd"/>
-            <w:r>
-              <w:rPr>
-                <w:rFonts w:ascii="Aptos" w:hAnsi="Aptos" w:cs="Aptos"/>
-                <w:sz w:val="22"/>
-                <w:szCs w:val="22"/>
-              </w:rPr>
-              <w:t xml:space="preserve"> summer” — Quraysh 106:2</w:t>
+              <w:t xml:space="preserve">“the Qur’an” — Al‑Baqarah 2:185</w:t>
+            </w:r>
+          </w:p>
+        </w:tc>
+      </w:tr>
+      <w:tr>
+        <w:trPr>
+          <w:cantSplit/>
+        </w:trPr>
+        <w:tc>
+          <w:tcPr>
+            <w:tcW w:w="1960" w:type="dxa"/>
+            <w:vAlign w:val="center"/>
+          </w:tcPr>
+          <w:p>
+            <w:pPr>
+              <w:bidi/>
+              <w:spacing w:before="60" w:after="60" w:line="520" w:lineRule="atLeast"/>
+              <w:jc w:val="center"/>
+              <w:rPr>
+                <w:rFonts w:ascii="KFGQPC HAFS Uthmanic Script" w:hAnsi="KFGQPC HAFS Uthmanic Script" w:cs="KFGQPC HAFS Uthmanic Script"/>
+                <w:sz w:val="44"/>
+                <w:szCs w:val="44"/>
+                <w:rtl/>
+              </w:rPr>
+            </w:pPr>
+            <w:r>
+              <w:rPr>
+                <w:rFonts w:ascii="KFGQPC HAFS Uthmanic Script" w:hAnsi="KFGQPC HAFS Uthmanic Script" w:cs="KFGQPC HAFS Uthmanic Script"/>
+                <w:sz w:val="44"/>
+                <w:szCs w:val="44"/>
+                <w:rtl/>
+              </w:rPr>
+              <w:t xml:space="preserve">ٱلرَّحِيمِ وقف</w:t>
+            </w:r>
+          </w:p>
+        </w:tc>
+        <w:tc>
+          <w:tcPr>
+            <w:tcW w:w="2360" w:type="dxa"/>
+            <w:vAlign w:val="center"/>
+          </w:tcPr>
+          <w:p>
+            <w:pPr>
+              <w:spacing w:before="60" w:after="60" w:line="240" w:lineRule="auto"/>
+              <w:rPr>
+                <w:rFonts w:ascii="Aptos" w:hAnsi="Aptos" w:cs="Aptos"/>
+                <w:sz w:val="22"/>
+                <w:szCs w:val="22"/>
+              </w:rPr>
+            </w:pPr>
+            <w:r>
+              <w:rPr>
+                <w:rFonts w:ascii="Aptos" w:hAnsi="Aptos" w:cs="Aptos"/>
+                <w:sz w:val="22"/>
+                <w:szCs w:val="22"/>
+              </w:rPr>
+              <w:t xml:space="preserve">Madd ʿĀriḍ li-s-Sukūn</w:t>
+            </w:r>
+          </w:p>
+        </w:tc>
+        <w:tc>
+          <w:tcPr>
+            <w:tcW w:w="1980" w:type="dxa"/>
+            <w:vAlign w:val="center"/>
+          </w:tcPr>
+          <w:p>
+            <w:pPr>
+              <w:spacing w:before="60" w:after="60" w:line="240" w:lineRule="auto"/>
+              <w:rPr>
+                <w:rFonts w:ascii="Aptos" w:hAnsi="Aptos" w:cs="Aptos"/>
+                <w:sz w:val="22"/>
+                <w:szCs w:val="22"/>
+              </w:rPr>
+            </w:pPr>
+            <w:r>
+              <w:rPr>
+                <w:rFonts w:ascii="Aptos" w:hAnsi="Aptos" w:cs="Aptos"/>
+                <w:sz w:val="22"/>
+                <w:szCs w:val="22"/>
+              </w:rPr>
+              <w:t xml:space="preserve">2, 4 or 6 ḥarakāt (at waqf) — one take, said three ways: 2, then 4, then 6</w:t>
+            </w:r>
+          </w:p>
+        </w:tc>
+        <w:tc>
+          <w:tcPr>
+            <w:tcW w:w="3060" w:type="dxa"/>
+            <w:vAlign w:val="center"/>
+          </w:tcPr>
+          <w:p>
+            <w:pPr>
+              <w:spacing w:before="60" w:after="60" w:line="240" w:lineRule="auto"/>
+              <w:rPr>
+                <w:rFonts w:ascii="Aptos" w:hAnsi="Aptos" w:cs="Aptos"/>
+                <w:sz w:val="22"/>
+                <w:szCs w:val="22"/>
+              </w:rPr>
+            </w:pPr>
+            <w:r>
+              <w:rPr>
+                <w:rFonts w:ascii="Aptos" w:hAnsi="Aptos" w:cs="Aptos"/>
+                <w:sz w:val="22"/>
+                <w:szCs w:val="22"/>
+              </w:rPr>
+              <w:t xml:space="preserve">“the Especially Merciful” — Al‑Fātiḥah 1:3</w:t>
+            </w:r>
+          </w:p>
+        </w:tc>
+      </w:tr>
+      <w:tr>
+        <w:trPr>
+          <w:cantSplit/>
+        </w:trPr>
+        <w:tc>
+          <w:tcPr>
+            <w:tcW w:w="1960" w:type="dxa"/>
+            <w:vAlign w:val="center"/>
+          </w:tcPr>
+          <w:p>
+            <w:pPr>
+              <w:bidi/>
+              <w:spacing w:before="60" w:after="60" w:line="520" w:lineRule="atLeast"/>
+              <w:jc w:val="center"/>
+              <w:rPr>
+                <w:rFonts w:ascii="KFGQPC HAFS Uthmanic Script" w:hAnsi="KFGQPC HAFS Uthmanic Script" w:cs="KFGQPC HAFS Uthmanic Script"/>
+                <w:sz w:val="44"/>
+                <w:szCs w:val="44"/>
+                <w:rtl/>
+              </w:rPr>
+            </w:pPr>
+            <w:r>
+              <w:rPr>
+                <w:rFonts w:ascii="KFGQPC HAFS Uthmanic Script" w:hAnsi="KFGQPC HAFS Uthmanic Script" w:cs="KFGQPC HAFS Uthmanic Script"/>
+                <w:sz w:val="44"/>
+                <w:szCs w:val="44"/>
+                <w:rtl/>
+              </w:rPr>
+              <w:t xml:space="preserve">خَوۡفٍ وقف</w:t>
+            </w:r>
+          </w:p>
+        </w:tc>
+        <w:tc>
+          <w:tcPr>
+            <w:tcW w:w="2360" w:type="dxa"/>
+            <w:vAlign w:val="center"/>
+          </w:tcPr>
+          <w:p>
+            <w:pPr>
+              <w:spacing w:before="60" w:after="60" w:line="240" w:lineRule="auto"/>
+              <w:rPr>
+                <w:rFonts w:ascii="Aptos" w:hAnsi="Aptos" w:cs="Aptos"/>
+                <w:sz w:val="22"/>
+                <w:szCs w:val="22"/>
+              </w:rPr>
+            </w:pPr>
+            <w:r>
+              <w:rPr>
+                <w:rFonts w:ascii="Aptos" w:hAnsi="Aptos" w:cs="Aptos"/>
+                <w:sz w:val="22"/>
+                <w:szCs w:val="22"/>
+              </w:rPr>
+              <w:t xml:space="preserve">Madd ʿĀriḍ li-s-Sukūn</w:t>
+            </w:r>
+          </w:p>
+        </w:tc>
+        <w:tc>
+          <w:tcPr>
+            <w:tcW w:w="1980" w:type="dxa"/>
+            <w:vAlign w:val="center"/>
+          </w:tcPr>
+          <w:p>
+            <w:pPr>
+              <w:spacing w:before="60" w:after="60" w:line="240" w:lineRule="auto"/>
+              <w:rPr>
+                <w:rFonts w:ascii="Aptos" w:hAnsi="Aptos" w:cs="Aptos"/>
+                <w:sz w:val="22"/>
+                <w:szCs w:val="22"/>
+              </w:rPr>
+            </w:pPr>
+            <w:r>
+              <w:rPr>
+                <w:rFonts w:ascii="Aptos" w:hAnsi="Aptos" w:cs="Aptos"/>
+                <w:sz w:val="22"/>
+                <w:szCs w:val="22"/>
+              </w:rPr>
+              <w:t xml:space="preserve">2, 4 or 6 ḥarakāt (at waqf) — one take, said three ways: 2, then 4, then 6</w:t>
+            </w:r>
+          </w:p>
+        </w:tc>
+        <w:tc>
+          <w:tcPr>
+            <w:tcW w:w="3060" w:type="dxa"/>
+            <w:vAlign w:val="center"/>
+          </w:tcPr>
+          <w:p>
+            <w:pPr>
+              <w:spacing w:before="60" w:after="60" w:line="240" w:lineRule="auto"/>
+              <w:rPr>
+                <w:rFonts w:ascii="Aptos" w:hAnsi="Aptos" w:cs="Aptos"/>
+                <w:sz w:val="22"/>
+                <w:szCs w:val="22"/>
+              </w:rPr>
+            </w:pPr>
+            <w:r>
+              <w:rPr>
+                <w:rFonts w:ascii="Aptos" w:hAnsi="Aptos" w:cs="Aptos"/>
+                <w:sz w:val="22"/>
+                <w:szCs w:val="22"/>
+              </w:rPr>
+              <w:t xml:space="preserve">“fear” — Quraysh 106:4</w:t>
+            </w:r>
+          </w:p>
+        </w:tc>
+      </w:tr>
+      <w:tr>
+        <w:trPr>
+          <w:cantSplit/>
+        </w:trPr>
+        <w:tc>
+          <w:tcPr>
+            <w:tcW w:w="1960" w:type="dxa"/>
+            <w:vAlign w:val="center"/>
+          </w:tcPr>
+          <w:p>
+            <w:pPr>
+              <w:bidi/>
+              <w:spacing w:before="60" w:after="60" w:line="520" w:lineRule="atLeast"/>
+              <w:jc w:val="center"/>
+              <w:rPr>
+                <w:rFonts w:ascii="KFGQPC HAFS Uthmanic Script" w:hAnsi="KFGQPC HAFS Uthmanic Script" w:cs="KFGQPC HAFS Uthmanic Script"/>
+                <w:sz w:val="44"/>
+                <w:szCs w:val="44"/>
+                <w:rtl/>
+              </w:rPr>
+            </w:pPr>
+            <w:r>
+              <w:rPr>
+                <w:rFonts w:ascii="KFGQPC HAFS Uthmanic Script" w:hAnsi="KFGQPC HAFS Uthmanic Script" w:cs="KFGQPC HAFS Uthmanic Script"/>
+                <w:sz w:val="44"/>
+                <w:szCs w:val="44"/>
+                <w:rtl/>
+              </w:rPr>
+              <w:t xml:space="preserve">ٱلصَّيۡفِ وقف</w:t>
+            </w:r>
+          </w:p>
+        </w:tc>
+        <w:tc>
+          <w:tcPr>
+            <w:tcW w:w="2360" w:type="dxa"/>
+            <w:vAlign w:val="center"/>
+          </w:tcPr>
+          <w:p>
+            <w:pPr>
+              <w:spacing w:before="60" w:after="60" w:line="240" w:lineRule="auto"/>
+              <w:rPr>
+                <w:rFonts w:ascii="Aptos" w:hAnsi="Aptos" w:cs="Aptos"/>
+                <w:sz w:val="22"/>
+                <w:szCs w:val="22"/>
+              </w:rPr>
+            </w:pPr>
+            <w:r>
+              <w:rPr>
+                <w:rFonts w:ascii="Aptos" w:hAnsi="Aptos" w:cs="Aptos"/>
+                <w:sz w:val="22"/>
+                <w:szCs w:val="22"/>
+              </w:rPr>
+              <w:t xml:space="preserve">Madd ʿĀriḍ li-s-Sukūn</w:t>
+            </w:r>
+          </w:p>
+        </w:tc>
+        <w:tc>
+          <w:tcPr>
+            <w:tcW w:w="1980" w:type="dxa"/>
+            <w:vAlign w:val="center"/>
+          </w:tcPr>
+          <w:p>
+            <w:pPr>
+              <w:spacing w:before="60" w:after="60" w:line="240" w:lineRule="auto"/>
+              <w:rPr>
+                <w:rFonts w:ascii="Aptos" w:hAnsi="Aptos" w:cs="Aptos"/>
+                <w:sz w:val="22"/>
+                <w:szCs w:val="22"/>
+              </w:rPr>
+            </w:pPr>
+            <w:r>
+              <w:rPr>
+                <w:rFonts w:ascii="Aptos" w:hAnsi="Aptos" w:cs="Aptos"/>
+                <w:sz w:val="22"/>
+                <w:szCs w:val="22"/>
+              </w:rPr>
+              <w:t xml:space="preserve">2, 4 or 6 ḥarakāt (at waqf) — one take, said three ways: 2, then 4, then 6</w:t>
+            </w:r>
+          </w:p>
+        </w:tc>
+        <w:tc>
+          <w:tcPr>
+            <w:tcW w:w="3060" w:type="dxa"/>
+            <w:vAlign w:val="center"/>
+          </w:tcPr>
+          <w:p>
+            <w:pPr>
+              <w:spacing w:before="60" w:after="60" w:line="240" w:lineRule="auto"/>
+              <w:rPr>
+                <w:rFonts w:ascii="Aptos" w:hAnsi="Aptos" w:cs="Aptos"/>
+                <w:sz w:val="22"/>
+                <w:szCs w:val="22"/>
+              </w:rPr>
+            </w:pPr>
+            <w:r>
+              <w:rPr>
+                <w:rFonts w:ascii="Aptos" w:hAnsi="Aptos" w:cs="Aptos"/>
+                <w:sz w:val="22"/>
+                <w:szCs w:val="22"/>
+              </w:rPr>
+              <w:t xml:space="preserve">“the summer” — Quraysh 106:2</w:t>
             </w:r>
           </w:p>
         </w:tc>

</xml_diff>

<commit_message>
Lesson 6 sheet: alif is a letter name with no madd
The ḥarfī Length column said "ا 2" — but أَلِف has no long vowel, so the
cell now reads "ا no madd · ل 6 · م 6". The generator does not read this
text into a badge, so words.json is unchanged and nothing redeploys.

Co-Authored-By: Claude Opus 5 <noreply@anthropic.com>
</commit_message>
<xml_diff>
--- a/Word Tables/مد لازم صلة عوض +.docx
+++ b/Word Tables/مد لازم صلة عوض +.docx
@@ -2427,7 +2427,7 @@
                 <w:sz w:val="22"/>
                 <w:szCs w:val="22"/>
               </w:rPr>
-              <w:t xml:space="preserve">ا 2 · ل 6 · م 6</w:t>
+              <w:t xml:space="preserve">ا no madd · ل 6 · م 6</w:t>
             </w:r>
           </w:p>
         </w:tc>
@@ -2541,7 +2541,7 @@
                 <w:sz w:val="22"/>
                 <w:szCs w:val="22"/>
               </w:rPr>
-              <w:t xml:space="preserve">ا 2 · ل 6 · م 6 · ص 6</w:t>
+              <w:t xml:space="preserve">ا no madd · ل 6 · م 6 · ص 6</w:t>
             </w:r>
           </w:p>
         </w:tc>
@@ -2673,7 +2673,7 @@
                 <w:sz w:val="22"/>
                 <w:szCs w:val="22"/>
               </w:rPr>
-              <w:t xml:space="preserve">ا 2 · ل 6 · ر 2</w:t>
+              <w:t xml:space="preserve">ا no madd · ل 6 · ر 2</w:t>
             </w:r>
           </w:p>
         </w:tc>
@@ -2787,7 +2787,7 @@
                 <w:sz w:val="22"/>
                 <w:szCs w:val="22"/>
               </w:rPr>
-              <w:t xml:space="preserve">ا 2 · ل 6 · م 6 · ر 2</w:t>
+              <w:t xml:space="preserve">ا no madd · ل 6 · م 6 · ر 2</w:t>
             </w:r>
           </w:p>
         </w:tc>

</xml_diff>